<commit_message>
feat: Erweitere Dashboard Lernbereich mit agent dateien und vorbereitung fuer KI-Agenten Training
</commit_message>
<xml_diff>
--- a/00_Wissen/04_Referenzen/Wiki/Context Engineering mit Harness AI LLM inkl.docx
+++ b/00_Wissen/04_Referenzen/Wiki/Context Engineering mit Harness AI LLM inkl.docx
@@ -14,14 +14,285 @@
           <w14:ligatures w14:val="none"/>
         </w:rPr>
       </w:pPr>
-      <w:r>
-        <w:rPr>
-          <w:rFonts w:ascii="Arial" w:eastAsia="Times New Roman" w:hAnsi="Arial" w:cs="Arial"/>
-          <w:kern w:val="0"/>
-          <w:lang w:eastAsia="de-DE"/>
-          <w14:ligatures w14:val="none"/>
-        </w:rPr>
-        <w:t>Context Engineering mit Harness AI LLM inkl. Menschen in the Loop in KI Entwicklungumgebung Betriebsssytem zu intergrieren und auch wichtig Thema DSGVO und AI-ARC und NIS2 und Auditor-AI zu berücksichtigen. API-Keys mit Rotting mit sicheren Vault in env. mit Raten limit. Angriff Promptsinjection vorbeugen. Erstelle mir einen Bilddiagramm für das passenden ganze KI Entwicklungsumgebung bzw. Plattform/Betriebssystem/Fabrik aus. Zum schluss welche Anbieter bittet AI tools für kurze Youtube-Videos Erstellung gibt? und AIVO KI Tools? bzw. AIVO Trade GEO Tools?</w:t>
+      <w:proofErr w:type="spellStart"/>
+      <w:r>
+        <w:rPr>
+          <w:rFonts w:ascii="Arial" w:eastAsia="Times New Roman" w:hAnsi="Arial" w:cs="Arial"/>
+          <w:kern w:val="0"/>
+          <w:lang w:eastAsia="de-DE"/>
+          <w14:ligatures w14:val="none"/>
+        </w:rPr>
+        <w:t>Context</w:t>
+      </w:r>
+      <w:proofErr w:type="spellEnd"/>
+      <w:r>
+        <w:rPr>
+          <w:rFonts w:ascii="Arial" w:eastAsia="Times New Roman" w:hAnsi="Arial" w:cs="Arial"/>
+          <w:kern w:val="0"/>
+          <w:lang w:eastAsia="de-DE"/>
+          <w14:ligatures w14:val="none"/>
+        </w:rPr>
+        <w:t xml:space="preserve"> Engineering mit Harness AI LLM inkl. Menschen in </w:t>
+      </w:r>
+      <w:proofErr w:type="spellStart"/>
+      <w:r>
+        <w:rPr>
+          <w:rFonts w:ascii="Arial" w:eastAsia="Times New Roman" w:hAnsi="Arial" w:cs="Arial"/>
+          <w:kern w:val="0"/>
+          <w:lang w:eastAsia="de-DE"/>
+          <w14:ligatures w14:val="none"/>
+        </w:rPr>
+        <w:t>the</w:t>
+      </w:r>
+      <w:proofErr w:type="spellEnd"/>
+      <w:r>
+        <w:rPr>
+          <w:rFonts w:ascii="Arial" w:eastAsia="Times New Roman" w:hAnsi="Arial" w:cs="Arial"/>
+          <w:kern w:val="0"/>
+          <w:lang w:eastAsia="de-DE"/>
+          <w14:ligatures w14:val="none"/>
+        </w:rPr>
+        <w:t xml:space="preserve"> Loop in KI </w:t>
+      </w:r>
+      <w:proofErr w:type="spellStart"/>
+      <w:r>
+        <w:rPr>
+          <w:rFonts w:ascii="Arial" w:eastAsia="Times New Roman" w:hAnsi="Arial" w:cs="Arial"/>
+          <w:kern w:val="0"/>
+          <w:lang w:eastAsia="de-DE"/>
+          <w14:ligatures w14:val="none"/>
+        </w:rPr>
+        <w:t>Entwicklungumgebung</w:t>
+      </w:r>
+      <w:proofErr w:type="spellEnd"/>
+      <w:r>
+        <w:rPr>
+          <w:rFonts w:ascii="Arial" w:eastAsia="Times New Roman" w:hAnsi="Arial" w:cs="Arial"/>
+          <w:kern w:val="0"/>
+          <w:lang w:eastAsia="de-DE"/>
+          <w14:ligatures w14:val="none"/>
+        </w:rPr>
+        <w:t xml:space="preserve"> </w:t>
+      </w:r>
+      <w:proofErr w:type="spellStart"/>
+      <w:r>
+        <w:rPr>
+          <w:rFonts w:ascii="Arial" w:eastAsia="Times New Roman" w:hAnsi="Arial" w:cs="Arial"/>
+          <w:kern w:val="0"/>
+          <w:lang w:eastAsia="de-DE"/>
+          <w14:ligatures w14:val="none"/>
+        </w:rPr>
+        <w:t>Betriebsssytem</w:t>
+      </w:r>
+      <w:proofErr w:type="spellEnd"/>
+      <w:r>
+        <w:rPr>
+          <w:rFonts w:ascii="Arial" w:eastAsia="Times New Roman" w:hAnsi="Arial" w:cs="Arial"/>
+          <w:kern w:val="0"/>
+          <w:lang w:eastAsia="de-DE"/>
+          <w14:ligatures w14:val="none"/>
+        </w:rPr>
+        <w:t xml:space="preserve"> zu </w:t>
+      </w:r>
+      <w:proofErr w:type="spellStart"/>
+      <w:r>
+        <w:rPr>
+          <w:rFonts w:ascii="Arial" w:eastAsia="Times New Roman" w:hAnsi="Arial" w:cs="Arial"/>
+          <w:kern w:val="0"/>
+          <w:lang w:eastAsia="de-DE"/>
+          <w14:ligatures w14:val="none"/>
+        </w:rPr>
+        <w:t>intergrieren</w:t>
+      </w:r>
+      <w:proofErr w:type="spellEnd"/>
+      <w:r>
+        <w:rPr>
+          <w:rFonts w:ascii="Arial" w:eastAsia="Times New Roman" w:hAnsi="Arial" w:cs="Arial"/>
+          <w:kern w:val="0"/>
+          <w:lang w:eastAsia="de-DE"/>
+          <w14:ligatures w14:val="none"/>
+        </w:rPr>
+        <w:t xml:space="preserve"> und auch wichtig Thema DSGVO und AI-ARC und NIS2 und Auditor-AI zu berücksichtigen. API-Keys mit </w:t>
+      </w:r>
+      <w:proofErr w:type="spellStart"/>
+      <w:r>
+        <w:rPr>
+          <w:rFonts w:ascii="Arial" w:eastAsia="Times New Roman" w:hAnsi="Arial" w:cs="Arial"/>
+          <w:kern w:val="0"/>
+          <w:lang w:eastAsia="de-DE"/>
+          <w14:ligatures w14:val="none"/>
+        </w:rPr>
+        <w:t>Rotting</w:t>
+      </w:r>
+      <w:proofErr w:type="spellEnd"/>
+      <w:r>
+        <w:rPr>
+          <w:rFonts w:ascii="Arial" w:eastAsia="Times New Roman" w:hAnsi="Arial" w:cs="Arial"/>
+          <w:kern w:val="0"/>
+          <w:lang w:eastAsia="de-DE"/>
+          <w14:ligatures w14:val="none"/>
+        </w:rPr>
+        <w:t xml:space="preserve"> mit sicheren </w:t>
+      </w:r>
+      <w:proofErr w:type="spellStart"/>
+      <w:r>
+        <w:rPr>
+          <w:rFonts w:ascii="Arial" w:eastAsia="Times New Roman" w:hAnsi="Arial" w:cs="Arial"/>
+          <w:kern w:val="0"/>
+          <w:lang w:eastAsia="de-DE"/>
+          <w14:ligatures w14:val="none"/>
+        </w:rPr>
+        <w:t>Vault</w:t>
+      </w:r>
+      <w:proofErr w:type="spellEnd"/>
+      <w:r>
+        <w:rPr>
+          <w:rFonts w:ascii="Arial" w:eastAsia="Times New Roman" w:hAnsi="Arial" w:cs="Arial"/>
+          <w:kern w:val="0"/>
+          <w:lang w:eastAsia="de-DE"/>
+          <w14:ligatures w14:val="none"/>
+        </w:rPr>
+        <w:t xml:space="preserve"> in </w:t>
+      </w:r>
+      <w:proofErr w:type="spellStart"/>
+      <w:r>
+        <w:rPr>
+          <w:rFonts w:ascii="Arial" w:eastAsia="Times New Roman" w:hAnsi="Arial" w:cs="Arial"/>
+          <w:kern w:val="0"/>
+          <w:lang w:eastAsia="de-DE"/>
+          <w14:ligatures w14:val="none"/>
+        </w:rPr>
+        <w:t>env</w:t>
+      </w:r>
+      <w:proofErr w:type="spellEnd"/>
+      <w:r>
+        <w:rPr>
+          <w:rFonts w:ascii="Arial" w:eastAsia="Times New Roman" w:hAnsi="Arial" w:cs="Arial"/>
+          <w:kern w:val="0"/>
+          <w:lang w:eastAsia="de-DE"/>
+          <w14:ligatures w14:val="none"/>
+        </w:rPr>
+        <w:t xml:space="preserve">. mit Raten </w:t>
+      </w:r>
+      <w:proofErr w:type="spellStart"/>
+      <w:r>
+        <w:rPr>
+          <w:rFonts w:ascii="Arial" w:eastAsia="Times New Roman" w:hAnsi="Arial" w:cs="Arial"/>
+          <w:kern w:val="0"/>
+          <w:lang w:eastAsia="de-DE"/>
+          <w14:ligatures w14:val="none"/>
+        </w:rPr>
+        <w:t>limit</w:t>
+      </w:r>
+      <w:proofErr w:type="spellEnd"/>
+      <w:r>
+        <w:rPr>
+          <w:rFonts w:ascii="Arial" w:eastAsia="Times New Roman" w:hAnsi="Arial" w:cs="Arial"/>
+          <w:kern w:val="0"/>
+          <w:lang w:eastAsia="de-DE"/>
+          <w14:ligatures w14:val="none"/>
+        </w:rPr>
+        <w:t xml:space="preserve">. Angriff </w:t>
+      </w:r>
+      <w:proofErr w:type="spellStart"/>
+      <w:r>
+        <w:rPr>
+          <w:rFonts w:ascii="Arial" w:eastAsia="Times New Roman" w:hAnsi="Arial" w:cs="Arial"/>
+          <w:kern w:val="0"/>
+          <w:lang w:eastAsia="de-DE"/>
+          <w14:ligatures w14:val="none"/>
+        </w:rPr>
+        <w:t>Promptsinjection</w:t>
+      </w:r>
+      <w:proofErr w:type="spellEnd"/>
+      <w:r>
+        <w:rPr>
+          <w:rFonts w:ascii="Arial" w:eastAsia="Times New Roman" w:hAnsi="Arial" w:cs="Arial"/>
+          <w:kern w:val="0"/>
+          <w:lang w:eastAsia="de-DE"/>
+          <w14:ligatures w14:val="none"/>
+        </w:rPr>
+        <w:t xml:space="preserve"> vorbeugen. Erstelle mir einen Bilddiagramm für das passenden ganze </w:t>
+      </w:r>
+      <w:proofErr w:type="gramStart"/>
+      <w:r>
+        <w:rPr>
+          <w:rFonts w:ascii="Arial" w:eastAsia="Times New Roman" w:hAnsi="Arial" w:cs="Arial"/>
+          <w:kern w:val="0"/>
+          <w:lang w:eastAsia="de-DE"/>
+          <w14:ligatures w14:val="none"/>
+        </w:rPr>
+        <w:t>KI Entwicklungsumgebung</w:t>
+      </w:r>
+      <w:proofErr w:type="gramEnd"/>
+      <w:r>
+        <w:rPr>
+          <w:rFonts w:ascii="Arial" w:eastAsia="Times New Roman" w:hAnsi="Arial" w:cs="Arial"/>
+          <w:kern w:val="0"/>
+          <w:lang w:eastAsia="de-DE"/>
+          <w14:ligatures w14:val="none"/>
+        </w:rPr>
+        <w:t xml:space="preserve"> bzw. Plattform/Betriebssystem/Fabrik aus. Zum </w:t>
+      </w:r>
+      <w:proofErr w:type="spellStart"/>
+      <w:r>
+        <w:rPr>
+          <w:rFonts w:ascii="Arial" w:eastAsia="Times New Roman" w:hAnsi="Arial" w:cs="Arial"/>
+          <w:kern w:val="0"/>
+          <w:lang w:eastAsia="de-DE"/>
+          <w14:ligatures w14:val="none"/>
+        </w:rPr>
+        <w:t>schluss</w:t>
+      </w:r>
+      <w:proofErr w:type="spellEnd"/>
+      <w:r>
+        <w:rPr>
+          <w:rFonts w:ascii="Arial" w:eastAsia="Times New Roman" w:hAnsi="Arial" w:cs="Arial"/>
+          <w:kern w:val="0"/>
+          <w:lang w:eastAsia="de-DE"/>
+          <w14:ligatures w14:val="none"/>
+        </w:rPr>
+        <w:t xml:space="preserve"> welche Anbieter bittet AI </w:t>
+      </w:r>
+      <w:proofErr w:type="spellStart"/>
+      <w:r>
+        <w:rPr>
+          <w:rFonts w:ascii="Arial" w:eastAsia="Times New Roman" w:hAnsi="Arial" w:cs="Arial"/>
+          <w:kern w:val="0"/>
+          <w:lang w:eastAsia="de-DE"/>
+          <w14:ligatures w14:val="none"/>
+        </w:rPr>
+        <w:t>tools</w:t>
+      </w:r>
+      <w:proofErr w:type="spellEnd"/>
+      <w:r>
+        <w:rPr>
+          <w:rFonts w:ascii="Arial" w:eastAsia="Times New Roman" w:hAnsi="Arial" w:cs="Arial"/>
+          <w:kern w:val="0"/>
+          <w:lang w:eastAsia="de-DE"/>
+          <w14:ligatures w14:val="none"/>
+        </w:rPr>
+        <w:t xml:space="preserve"> für kurze </w:t>
+      </w:r>
+      <w:proofErr w:type="spellStart"/>
+      <w:r>
+        <w:rPr>
+          <w:rFonts w:ascii="Arial" w:eastAsia="Times New Roman" w:hAnsi="Arial" w:cs="Arial"/>
+          <w:kern w:val="0"/>
+          <w:lang w:eastAsia="de-DE"/>
+          <w14:ligatures w14:val="none"/>
+        </w:rPr>
+        <w:t>Youtube</w:t>
+      </w:r>
+      <w:proofErr w:type="spellEnd"/>
+      <w:r>
+        <w:rPr>
+          <w:rFonts w:ascii="Arial" w:eastAsia="Times New Roman" w:hAnsi="Arial" w:cs="Arial"/>
+          <w:kern w:val="0"/>
+          <w:lang w:eastAsia="de-DE"/>
+          <w14:ligatures w14:val="none"/>
+        </w:rPr>
+        <w:t>-Videos Erstellung gibt? und AIVO KI Tools? bzw. AIVO Trade GEO Tools?</w:t>
       </w:r>
     </w:p>
     <w:p>
@@ -41,18 +312,51 @@
           <w:lang w:eastAsia="de-DE"/>
           <w14:ligatures w14:val="none"/>
         </w:rPr>
-        <w:t xml:space="preserve">Um ein gesetzeskonformes, sicheres und hochperformantes KI-Betriebssystem für Ihr Business aufzubauen, müssen Sie </w:t>
-      </w:r>
-      <w:r>
-        <w:rPr>
-          <w:rFonts w:ascii="Arial" w:eastAsia="Times New Roman" w:hAnsi="Arial" w:cs="Arial"/>
-          <w:b/>
-          <w:bCs/>
-          <w:kern w:val="0"/>
-          <w:lang w:eastAsia="de-DE"/>
-          <w14:ligatures w14:val="none"/>
-        </w:rPr>
-        <w:t>Harnessing (Evaluierung)</w:t>
+        <w:t xml:space="preserve">Um ein gesetzeskonformes, sicheres und </w:t>
+      </w:r>
+      <w:proofErr w:type="spellStart"/>
+      <w:r>
+        <w:rPr>
+          <w:rFonts w:ascii="Arial" w:eastAsia="Times New Roman" w:hAnsi="Arial" w:cs="Arial"/>
+          <w:kern w:val="0"/>
+          <w:lang w:eastAsia="de-DE"/>
+          <w14:ligatures w14:val="none"/>
+        </w:rPr>
+        <w:t>hochperformantes</w:t>
+      </w:r>
+      <w:proofErr w:type="spellEnd"/>
+      <w:r>
+        <w:rPr>
+          <w:rFonts w:ascii="Arial" w:eastAsia="Times New Roman" w:hAnsi="Arial" w:cs="Arial"/>
+          <w:kern w:val="0"/>
+          <w:lang w:eastAsia="de-DE"/>
+          <w14:ligatures w14:val="none"/>
+        </w:rPr>
+        <w:t xml:space="preserve"> KI-Betriebssystem für Ihr Business aufzubauen, müssen Sie </w:t>
+      </w:r>
+      <w:proofErr w:type="spellStart"/>
+      <w:r>
+        <w:rPr>
+          <w:rFonts w:ascii="Arial" w:eastAsia="Times New Roman" w:hAnsi="Arial" w:cs="Arial"/>
+          <w:b/>
+          <w:bCs/>
+          <w:kern w:val="0"/>
+          <w:lang w:eastAsia="de-DE"/>
+          <w14:ligatures w14:val="none"/>
+        </w:rPr>
+        <w:t>Harnessing</w:t>
+      </w:r>
+      <w:proofErr w:type="spellEnd"/>
+      <w:r>
+        <w:rPr>
+          <w:rFonts w:ascii="Arial" w:eastAsia="Times New Roman" w:hAnsi="Arial" w:cs="Arial"/>
+          <w:b/>
+          <w:bCs/>
+          <w:kern w:val="0"/>
+          <w:lang w:eastAsia="de-DE"/>
+          <w14:ligatures w14:val="none"/>
+        </w:rPr>
+        <w:t xml:space="preserve"> (Evaluierung)</w:t>
       </w:r>
       <w:r>
         <w:rPr>
@@ -72,7 +376,31 @@
           <w:lang w:eastAsia="de-DE"/>
           <w14:ligatures w14:val="none"/>
         </w:rPr>
-        <w:t>Compliance (DSGVO, AI Act, NIS2)</w:t>
+        <w:t xml:space="preserve">Compliance (DSGVO, </w:t>
+      </w:r>
+      <w:proofErr w:type="gramStart"/>
+      <w:r>
+        <w:rPr>
+          <w:rFonts w:ascii="Arial" w:eastAsia="Times New Roman" w:hAnsi="Arial" w:cs="Arial"/>
+          <w:b/>
+          <w:bCs/>
+          <w:kern w:val="0"/>
+          <w:lang w:eastAsia="de-DE"/>
+          <w14:ligatures w14:val="none"/>
+        </w:rPr>
+        <w:t>AI Act</w:t>
+      </w:r>
+      <w:proofErr w:type="gramEnd"/>
+      <w:r>
+        <w:rPr>
+          <w:rFonts w:ascii="Arial" w:eastAsia="Times New Roman" w:hAnsi="Arial" w:cs="Arial"/>
+          <w:b/>
+          <w:bCs/>
+          <w:kern w:val="0"/>
+          <w:lang w:eastAsia="de-DE"/>
+          <w14:ligatures w14:val="none"/>
+        </w:rPr>
+        <w:t>, NIS2)</w:t>
       </w:r>
       <w:r>
         <w:rPr>
@@ -92,7 +420,55 @@
           <w:lang w:eastAsia="de-DE"/>
           <w14:ligatures w14:val="none"/>
         </w:rPr>
-        <w:t>Security (Key-Vault, Prompt-Injection-Schutz)</w:t>
+        <w:t>Security (Key-</w:t>
+      </w:r>
+      <w:proofErr w:type="spellStart"/>
+      <w:r>
+        <w:rPr>
+          <w:rFonts w:ascii="Arial" w:eastAsia="Times New Roman" w:hAnsi="Arial" w:cs="Arial"/>
+          <w:b/>
+          <w:bCs/>
+          <w:kern w:val="0"/>
+          <w:lang w:eastAsia="de-DE"/>
+          <w14:ligatures w14:val="none"/>
+        </w:rPr>
+        <w:t>Vault</w:t>
+      </w:r>
+      <w:proofErr w:type="spellEnd"/>
+      <w:r>
+        <w:rPr>
+          <w:rFonts w:ascii="Arial" w:eastAsia="Times New Roman" w:hAnsi="Arial" w:cs="Arial"/>
+          <w:b/>
+          <w:bCs/>
+          <w:kern w:val="0"/>
+          <w:lang w:eastAsia="de-DE"/>
+          <w14:ligatures w14:val="none"/>
+        </w:rPr>
+        <w:t>, Prompt-</w:t>
+      </w:r>
+      <w:proofErr w:type="spellStart"/>
+      <w:r>
+        <w:rPr>
+          <w:rFonts w:ascii="Arial" w:eastAsia="Times New Roman" w:hAnsi="Arial" w:cs="Arial"/>
+          <w:b/>
+          <w:bCs/>
+          <w:kern w:val="0"/>
+          <w:lang w:eastAsia="de-DE"/>
+          <w14:ligatures w14:val="none"/>
+        </w:rPr>
+        <w:t>Injection</w:t>
+      </w:r>
+      <w:proofErr w:type="spellEnd"/>
+      <w:r>
+        <w:rPr>
+          <w:rFonts w:ascii="Arial" w:eastAsia="Times New Roman" w:hAnsi="Arial" w:cs="Arial"/>
+          <w:b/>
+          <w:bCs/>
+          <w:kern w:val="0"/>
+          <w:lang w:eastAsia="de-DE"/>
+          <w14:ligatures w14:val="none"/>
+        </w:rPr>
+        <w:t>-Schutz)</w:t>
       </w:r>
       <w:r>
         <w:rPr>
@@ -112,7 +488,31 @@
           <w:lang w:eastAsia="de-DE"/>
           <w14:ligatures w14:val="none"/>
         </w:rPr>
-        <w:t>Human-in-the-Loop</w:t>
+        <w:t>Human-in-</w:t>
+      </w:r>
+      <w:proofErr w:type="spellStart"/>
+      <w:r>
+        <w:rPr>
+          <w:rFonts w:ascii="Arial" w:eastAsia="Times New Roman" w:hAnsi="Arial" w:cs="Arial"/>
+          <w:b/>
+          <w:bCs/>
+          <w:kern w:val="0"/>
+          <w:lang w:eastAsia="de-DE"/>
+          <w14:ligatures w14:val="none"/>
+        </w:rPr>
+        <w:t>the</w:t>
+      </w:r>
+      <w:proofErr w:type="spellEnd"/>
+      <w:r>
+        <w:rPr>
+          <w:rFonts w:ascii="Arial" w:eastAsia="Times New Roman" w:hAnsi="Arial" w:cs="Arial"/>
+          <w:b/>
+          <w:bCs/>
+          <w:kern w:val="0"/>
+          <w:lang w:eastAsia="de-DE"/>
+          <w14:ligatures w14:val="none"/>
+        </w:rPr>
+        <w:t>-Loop</w:t>
       </w:r>
       <w:r>
         <w:rPr>
@@ -124,6 +524,7 @@
         <w:t xml:space="preserve"> strukturell miteinander verknüpfen. Das im </w:t>
       </w:r>
       <w:hyperlink r:id="rId5" w:tgtFrame="_blank" w:history="1">
+        <w:proofErr w:type="spellStart"/>
         <w:r>
           <w:rPr>
             <w:rFonts w:ascii="Arial" w:eastAsia="Times New Roman" w:hAnsi="Arial" w:cs="Arial"/>
@@ -133,7 +534,43 @@
             <w:lang w:eastAsia="de-DE"/>
             <w14:ligatures w14:val="none"/>
           </w:rPr>
-          <w:t>agorum core Albert AI Kosmos</w:t>
+          <w:t>agorum</w:t>
+        </w:r>
+        <w:proofErr w:type="spellEnd"/>
+        <w:r>
+          <w:rPr>
+            <w:rFonts w:ascii="Arial" w:eastAsia="Times New Roman" w:hAnsi="Arial" w:cs="Arial"/>
+            <w:color w:val="0000FF"/>
+            <w:kern w:val="0"/>
+            <w:u w:val="single"/>
+            <w:lang w:eastAsia="de-DE"/>
+            <w14:ligatures w14:val="none"/>
+          </w:rPr>
+          <w:t xml:space="preserve"> </w:t>
+        </w:r>
+        <w:proofErr w:type="spellStart"/>
+        <w:r>
+          <w:rPr>
+            <w:rFonts w:ascii="Arial" w:eastAsia="Times New Roman" w:hAnsi="Arial" w:cs="Arial"/>
+            <w:color w:val="0000FF"/>
+            <w:kern w:val="0"/>
+            <w:u w:val="single"/>
+            <w:lang w:eastAsia="de-DE"/>
+            <w14:ligatures w14:val="none"/>
+          </w:rPr>
+          <w:t>core</w:t>
+        </w:r>
+        <w:proofErr w:type="spellEnd"/>
+        <w:r>
+          <w:rPr>
+            <w:rFonts w:ascii="Arial" w:eastAsia="Times New Roman" w:hAnsi="Arial" w:cs="Arial"/>
+            <w:color w:val="0000FF"/>
+            <w:kern w:val="0"/>
+            <w:u w:val="single"/>
+            <w:lang w:eastAsia="de-DE"/>
+            <w14:ligatures w14:val="none"/>
+          </w:rPr>
+          <w:t xml:space="preserve"> Albert AI Kosmos</w:t>
         </w:r>
       </w:hyperlink>
       <w:r>
@@ -154,7 +591,31 @@
           <w:lang w:eastAsia="de-DE"/>
           <w14:ligatures w14:val="none"/>
         </w:rPr>
-        <w:t>Model Context Protocol (MCP)</w:t>
+        <w:t xml:space="preserve">Model </w:t>
+      </w:r>
+      <w:proofErr w:type="spellStart"/>
+      <w:r>
+        <w:rPr>
+          <w:rFonts w:ascii="Arial" w:eastAsia="Times New Roman" w:hAnsi="Arial" w:cs="Arial"/>
+          <w:b/>
+          <w:bCs/>
+          <w:kern w:val="0"/>
+          <w:lang w:eastAsia="de-DE"/>
+          <w14:ligatures w14:val="none"/>
+        </w:rPr>
+        <w:t>Context</w:t>
+      </w:r>
+      <w:proofErr w:type="spellEnd"/>
+      <w:r>
+        <w:rPr>
+          <w:rFonts w:ascii="Arial" w:eastAsia="Times New Roman" w:hAnsi="Arial" w:cs="Arial"/>
+          <w:b/>
+          <w:bCs/>
+          <w:kern w:val="0"/>
+          <w:lang w:eastAsia="de-DE"/>
+          <w14:ligatures w14:val="none"/>
+        </w:rPr>
+        <w:t xml:space="preserve"> Protocol (MCP)</w:t>
       </w:r>
       <w:r>
         <w:rPr>
@@ -232,16 +693,53 @@
           <w14:ligatures w14:val="none"/>
         </w:rPr>
       </w:pPr>
-      <w:r>
-        <w:rPr>
-          <w:rFonts w:ascii="Arial" w:eastAsia="Times New Roman" w:hAnsi="Arial" w:cs="Arial"/>
-          <w:b/>
-          <w:bCs/>
-          <w:kern w:val="0"/>
-          <w:lang w:eastAsia="de-DE"/>
-          <w14:ligatures w14:val="none"/>
-        </w:rPr>
-        <w:t>Context Engineering &amp; Harness AI (LLM Evaluation)</w:t>
+      <w:proofErr w:type="spellStart"/>
+      <w:r>
+        <w:rPr>
+          <w:rFonts w:ascii="Arial" w:eastAsia="Times New Roman" w:hAnsi="Arial" w:cs="Arial"/>
+          <w:b/>
+          <w:bCs/>
+          <w:kern w:val="0"/>
+          <w:lang w:eastAsia="de-DE"/>
+          <w14:ligatures w14:val="none"/>
+        </w:rPr>
+        <w:t>Context</w:t>
+      </w:r>
+      <w:proofErr w:type="spellEnd"/>
+      <w:r>
+        <w:rPr>
+          <w:rFonts w:ascii="Arial" w:eastAsia="Times New Roman" w:hAnsi="Arial" w:cs="Arial"/>
+          <w:b/>
+          <w:bCs/>
+          <w:kern w:val="0"/>
+          <w:lang w:eastAsia="de-DE"/>
+          <w14:ligatures w14:val="none"/>
+        </w:rPr>
+        <w:t xml:space="preserve"> Engineering &amp; Harness AI (</w:t>
+      </w:r>
+      <w:proofErr w:type="gramStart"/>
+      <w:r>
+        <w:rPr>
+          <w:rFonts w:ascii="Arial" w:eastAsia="Times New Roman" w:hAnsi="Arial" w:cs="Arial"/>
+          <w:b/>
+          <w:bCs/>
+          <w:kern w:val="0"/>
+          <w:lang w:eastAsia="de-DE"/>
+          <w14:ligatures w14:val="none"/>
+        </w:rPr>
+        <w:t>LLM Evaluation</w:t>
+      </w:r>
+      <w:proofErr w:type="gramEnd"/>
+      <w:r>
+        <w:rPr>
+          <w:rFonts w:ascii="Arial" w:eastAsia="Times New Roman" w:hAnsi="Arial" w:cs="Arial"/>
+          <w:b/>
+          <w:bCs/>
+          <w:kern w:val="0"/>
+          <w:lang w:eastAsia="de-DE"/>
+          <w14:ligatures w14:val="none"/>
+        </w:rPr>
+        <w:t>)</w:t>
       </w:r>
     </w:p>
     <w:p>
@@ -261,8 +759,29 @@
           <w:lang w:eastAsia="de-DE"/>
           <w14:ligatures w14:val="none"/>
         </w:rPr>
-        <w:t xml:space="preserve">Sie dürfen Ihre Daten nicht ungefiltert an LLMs senden. Context Engineering strukturiert die Datenströme, bevor ein Harness (z. B. </w:t>
-      </w:r>
+        <w:t xml:space="preserve">Sie dürfen Ihre Daten nicht ungefiltert an LLMs senden. </w:t>
+      </w:r>
+      <w:proofErr w:type="spellStart"/>
+      <w:r>
+        <w:rPr>
+          <w:rFonts w:ascii="Arial" w:eastAsia="Times New Roman" w:hAnsi="Arial" w:cs="Arial"/>
+          <w:kern w:val="0"/>
+          <w:lang w:eastAsia="de-DE"/>
+          <w14:ligatures w14:val="none"/>
+        </w:rPr>
+        <w:t>Context</w:t>
+      </w:r>
+      <w:proofErr w:type="spellEnd"/>
+      <w:r>
+        <w:rPr>
+          <w:rFonts w:ascii="Arial" w:eastAsia="Times New Roman" w:hAnsi="Arial" w:cs="Arial"/>
+          <w:kern w:val="0"/>
+          <w:lang w:eastAsia="de-DE"/>
+          <w14:ligatures w14:val="none"/>
+        </w:rPr>
+        <w:t xml:space="preserve"> Engineering strukturiert die Datenströme, bevor ein Harness (z. B. </w:t>
+      </w:r>
+      <w:proofErr w:type="spellStart"/>
       <w:r>
         <w:rPr>
           <w:rFonts w:ascii="Courier New" w:eastAsia="Times New Roman" w:hAnsi="Courier New" w:cs="Courier New"/>
@@ -274,6 +793,7 @@
         </w:rPr>
         <w:t>DeepEval</w:t>
       </w:r>
+      <w:proofErr w:type="spellEnd"/>
       <w:r>
         <w:rPr>
           <w:rFonts w:ascii="Arial" w:eastAsia="Times New Roman" w:hAnsi="Arial" w:cs="Arial"/>
@@ -283,6 +803,7 @@
         </w:rPr>
         <w:t xml:space="preserve">, </w:t>
       </w:r>
+      <w:proofErr w:type="spellStart"/>
       <w:r>
         <w:rPr>
           <w:rFonts w:ascii="Courier New" w:eastAsia="Times New Roman" w:hAnsi="Courier New" w:cs="Courier New"/>
@@ -294,6 +815,7 @@
         </w:rPr>
         <w:t>Ragas</w:t>
       </w:r>
+      <w:proofErr w:type="spellEnd"/>
       <w:r>
         <w:rPr>
           <w:rFonts w:ascii="Arial" w:eastAsia="Times New Roman" w:hAnsi="Arial" w:cs="Arial"/>
@@ -303,6 +825,7 @@
         </w:rPr>
         <w:t xml:space="preserve"> oder </w:t>
       </w:r>
+      <w:proofErr w:type="spellStart"/>
       <w:r>
         <w:rPr>
           <w:rFonts w:ascii="Courier New" w:eastAsia="Times New Roman" w:hAnsi="Courier New" w:cs="Courier New"/>
@@ -314,6 +837,7 @@
         </w:rPr>
         <w:t>LangSmith</w:t>
       </w:r>
+      <w:proofErr w:type="spellEnd"/>
       <w:r>
         <w:rPr>
           <w:rFonts w:ascii="Arial" w:eastAsia="Times New Roman" w:hAnsi="Arial" w:cs="Arial"/>
@@ -338,25 +862,78 @@
           <w14:ligatures w14:val="none"/>
         </w:rPr>
       </w:pPr>
-      <w:r>
-        <w:rPr>
-          <w:rFonts w:ascii="Arial" w:eastAsia="Times New Roman" w:hAnsi="Arial" w:cs="Arial"/>
-          <w:b/>
-          <w:bCs/>
-          <w:kern w:val="0"/>
-          <w:lang w:eastAsia="de-DE"/>
-          <w14:ligatures w14:val="none"/>
-        </w:rPr>
-        <w:t>Context Engineering:</w:t>
-      </w:r>
-      <w:r>
-        <w:rPr>
-          <w:rFonts w:ascii="Arial" w:eastAsia="Times New Roman" w:hAnsi="Arial" w:cs="Arial"/>
-          <w:kern w:val="0"/>
-          <w:lang w:eastAsia="de-DE"/>
-          <w14:ligatures w14:val="none"/>
-        </w:rPr>
-        <w:t xml:space="preserve"> Rohdaten aus Ihrem agorum core DMS werden mit Systemprompts, Benutzerkontext und Berechtigungsfiltern (wer darf das Dokument sehen?) angereichert.</w:t>
+      <w:proofErr w:type="spellStart"/>
+      <w:r>
+        <w:rPr>
+          <w:rFonts w:ascii="Arial" w:eastAsia="Times New Roman" w:hAnsi="Arial" w:cs="Arial"/>
+          <w:b/>
+          <w:bCs/>
+          <w:kern w:val="0"/>
+          <w:lang w:eastAsia="de-DE"/>
+          <w14:ligatures w14:val="none"/>
+        </w:rPr>
+        <w:t>Context</w:t>
+      </w:r>
+      <w:proofErr w:type="spellEnd"/>
+      <w:r>
+        <w:rPr>
+          <w:rFonts w:ascii="Arial" w:eastAsia="Times New Roman" w:hAnsi="Arial" w:cs="Arial"/>
+          <w:b/>
+          <w:bCs/>
+          <w:kern w:val="0"/>
+          <w:lang w:eastAsia="de-DE"/>
+          <w14:ligatures w14:val="none"/>
+        </w:rPr>
+        <w:t xml:space="preserve"> Engineering:</w:t>
+      </w:r>
+      <w:r>
+        <w:rPr>
+          <w:rFonts w:ascii="Arial" w:eastAsia="Times New Roman" w:hAnsi="Arial" w:cs="Arial"/>
+          <w:kern w:val="0"/>
+          <w:lang w:eastAsia="de-DE"/>
+          <w14:ligatures w14:val="none"/>
+        </w:rPr>
+        <w:t xml:space="preserve"> Rohdaten aus Ihrem </w:t>
+      </w:r>
+      <w:proofErr w:type="spellStart"/>
+      <w:r>
+        <w:rPr>
+          <w:rFonts w:ascii="Arial" w:eastAsia="Times New Roman" w:hAnsi="Arial" w:cs="Arial"/>
+          <w:kern w:val="0"/>
+          <w:lang w:eastAsia="de-DE"/>
+          <w14:ligatures w14:val="none"/>
+        </w:rPr>
+        <w:t>agorum</w:t>
+      </w:r>
+      <w:proofErr w:type="spellEnd"/>
+      <w:r>
+        <w:rPr>
+          <w:rFonts w:ascii="Arial" w:eastAsia="Times New Roman" w:hAnsi="Arial" w:cs="Arial"/>
+          <w:kern w:val="0"/>
+          <w:lang w:eastAsia="de-DE"/>
+          <w14:ligatures w14:val="none"/>
+        </w:rPr>
+        <w:t xml:space="preserve"> </w:t>
+      </w:r>
+      <w:proofErr w:type="spellStart"/>
+      <w:r>
+        <w:rPr>
+          <w:rFonts w:ascii="Arial" w:eastAsia="Times New Roman" w:hAnsi="Arial" w:cs="Arial"/>
+          <w:kern w:val="0"/>
+          <w:lang w:eastAsia="de-DE"/>
+          <w14:ligatures w14:val="none"/>
+        </w:rPr>
+        <w:t>core</w:t>
+      </w:r>
+      <w:proofErr w:type="spellEnd"/>
+      <w:r>
+        <w:rPr>
+          <w:rFonts w:ascii="Arial" w:eastAsia="Times New Roman" w:hAnsi="Arial" w:cs="Arial"/>
+          <w:kern w:val="0"/>
+          <w:lang w:eastAsia="de-DE"/>
+          <w14:ligatures w14:val="none"/>
+        </w:rPr>
+        <w:t xml:space="preserve"> DMS werden mit Systemprompts, Benutzerkontext und Berechtigungsfiltern (wer darf das Dokument sehen?) angereichert.</w:t>
       </w:r>
     </w:p>
     <w:p>
@@ -393,6 +970,7 @@
         </w:rPr>
         <w:t xml:space="preserve"> Bevor eine Ausgabe an einen Trade-Agenten oder ein DMS-Dokument übergeben wird, prüft das Harness im Hintergrund Metriken wie </w:t>
       </w:r>
+      <w:proofErr w:type="spellStart"/>
       <w:r>
         <w:rPr>
           <w:rFonts w:ascii="Arial" w:eastAsia="Times New Roman" w:hAnsi="Arial" w:cs="Arial"/>
@@ -404,6 +982,7 @@
         </w:rPr>
         <w:t>Faithfulness</w:t>
       </w:r>
+      <w:proofErr w:type="spellEnd"/>
       <w:r>
         <w:rPr>
           <w:rFonts w:ascii="Arial" w:eastAsia="Times New Roman" w:hAnsi="Arial" w:cs="Arial"/>
@@ -413,6 +992,7 @@
         </w:rPr>
         <w:t xml:space="preserve"> (Wahrheitsgehalt bezogen auf die Quelle) und </w:t>
       </w:r>
+      <w:proofErr w:type="spellStart"/>
       <w:r>
         <w:rPr>
           <w:rFonts w:ascii="Arial" w:eastAsia="Times New Roman" w:hAnsi="Arial" w:cs="Arial"/>
@@ -422,8 +1002,33 @@
           <w:lang w:eastAsia="de-DE"/>
           <w14:ligatures w14:val="none"/>
         </w:rPr>
-        <w:t>Semantic Similarity</w:t>
-      </w:r>
+        <w:t>Semantic</w:t>
+      </w:r>
+      <w:proofErr w:type="spellEnd"/>
+      <w:r>
+        <w:rPr>
+          <w:rFonts w:ascii="Arial" w:eastAsia="Times New Roman" w:hAnsi="Arial" w:cs="Arial"/>
+          <w:i/>
+          <w:iCs/>
+          <w:kern w:val="0"/>
+          <w:lang w:eastAsia="de-DE"/>
+          <w14:ligatures w14:val="none"/>
+        </w:rPr>
+        <w:t xml:space="preserve"> </w:t>
+      </w:r>
+      <w:proofErr w:type="spellStart"/>
+      <w:r>
+        <w:rPr>
+          <w:rFonts w:ascii="Arial" w:eastAsia="Times New Roman" w:hAnsi="Arial" w:cs="Arial"/>
+          <w:i/>
+          <w:iCs/>
+          <w:kern w:val="0"/>
+          <w:lang w:eastAsia="de-DE"/>
+          <w14:ligatures w14:val="none"/>
+        </w:rPr>
+        <w:t>Similarity</w:t>
+      </w:r>
+      <w:proofErr w:type="spellEnd"/>
       <w:r>
         <w:rPr>
           <w:rFonts w:ascii="Arial" w:eastAsia="Times New Roman" w:hAnsi="Arial" w:cs="Arial"/>
@@ -455,7 +1060,31 @@
           <w:lang w:eastAsia="de-DE"/>
           <w14:ligatures w14:val="none"/>
         </w:rPr>
-        <w:t>Human-in-the-Loop (HITL)</w:t>
+        <w:t>Human-in-</w:t>
+      </w:r>
+      <w:proofErr w:type="spellStart"/>
+      <w:r>
+        <w:rPr>
+          <w:rFonts w:ascii="Arial" w:eastAsia="Times New Roman" w:hAnsi="Arial" w:cs="Arial"/>
+          <w:b/>
+          <w:bCs/>
+          <w:kern w:val="0"/>
+          <w:lang w:eastAsia="de-DE"/>
+          <w14:ligatures w14:val="none"/>
+        </w:rPr>
+        <w:t>the</w:t>
+      </w:r>
+      <w:proofErr w:type="spellEnd"/>
+      <w:r>
+        <w:rPr>
+          <w:rFonts w:ascii="Arial" w:eastAsia="Times New Roman" w:hAnsi="Arial" w:cs="Arial"/>
+          <w:b/>
+          <w:bCs/>
+          <w:kern w:val="0"/>
+          <w:lang w:eastAsia="de-DE"/>
+          <w14:ligatures w14:val="none"/>
+        </w:rPr>
+        <w:t>-Loop (HITL)</w:t>
       </w:r>
     </w:p>
     <w:p>
@@ -501,16 +1130,60 @@
           <w:lang w:eastAsia="de-DE"/>
           <w14:ligatures w14:val="none"/>
         </w:rPr>
-        <w:t>Bedingte Freigabe (Conditional Gates):</w:t>
-      </w:r>
-      <w:r>
-        <w:rPr>
-          <w:rFonts w:ascii="Arial" w:eastAsia="Times New Roman" w:hAnsi="Arial" w:cs="Arial"/>
-          <w:kern w:val="0"/>
-          <w:lang w:eastAsia="de-DE"/>
-          <w14:ligatures w14:val="none"/>
-        </w:rPr>
-        <w:t xml:space="preserve"> Wenn die Konfidenz des LLMs unter 85% fällt oder ein Trade-Volumen einen Schwellenwert überschreitet, stoppt LangGraph den Prozess.</w:t>
+        <w:t>Bedingte Freigabe (</w:t>
+      </w:r>
+      <w:proofErr w:type="spellStart"/>
+      <w:r>
+        <w:rPr>
+          <w:rFonts w:ascii="Arial" w:eastAsia="Times New Roman" w:hAnsi="Arial" w:cs="Arial"/>
+          <w:b/>
+          <w:bCs/>
+          <w:kern w:val="0"/>
+          <w:lang w:eastAsia="de-DE"/>
+          <w14:ligatures w14:val="none"/>
+        </w:rPr>
+        <w:t>Conditional</w:t>
+      </w:r>
+      <w:proofErr w:type="spellEnd"/>
+      <w:r>
+        <w:rPr>
+          <w:rFonts w:ascii="Arial" w:eastAsia="Times New Roman" w:hAnsi="Arial" w:cs="Arial"/>
+          <w:b/>
+          <w:bCs/>
+          <w:kern w:val="0"/>
+          <w:lang w:eastAsia="de-DE"/>
+          <w14:ligatures w14:val="none"/>
+        </w:rPr>
+        <w:t xml:space="preserve"> Gates):</w:t>
+      </w:r>
+      <w:r>
+        <w:rPr>
+          <w:rFonts w:ascii="Arial" w:eastAsia="Times New Roman" w:hAnsi="Arial" w:cs="Arial"/>
+          <w:kern w:val="0"/>
+          <w:lang w:eastAsia="de-DE"/>
+          <w14:ligatures w14:val="none"/>
+        </w:rPr>
+        <w:t xml:space="preserve"> Wenn die Konfidenz des LLMs unter 85% fällt oder ein Trade-Volumen einen Schwellenwert überschreitet, stoppt </w:t>
+      </w:r>
+      <w:proofErr w:type="spellStart"/>
+      <w:r>
+        <w:rPr>
+          <w:rFonts w:ascii="Arial" w:eastAsia="Times New Roman" w:hAnsi="Arial" w:cs="Arial"/>
+          <w:kern w:val="0"/>
+          <w:lang w:eastAsia="de-DE"/>
+          <w14:ligatures w14:val="none"/>
+        </w:rPr>
+        <w:t>LangGraph</w:t>
+      </w:r>
+      <w:proofErr w:type="spellEnd"/>
+      <w:r>
+        <w:rPr>
+          <w:rFonts w:ascii="Arial" w:eastAsia="Times New Roman" w:hAnsi="Arial" w:cs="Arial"/>
+          <w:kern w:val="0"/>
+          <w:lang w:eastAsia="de-DE"/>
+          <w14:ligatures w14:val="none"/>
+        </w:rPr>
+        <w:t xml:space="preserve"> den Prozess.</w:t>
       </w:r>
     </w:p>
     <w:p>
@@ -545,7 +1218,67 @@
           <w:lang w:eastAsia="de-DE"/>
           <w14:ligatures w14:val="none"/>
         </w:rPr>
-        <w:t xml:space="preserve"> Der Vorfall wird in Ihrer Entwicklungsumgebung (OpenHands UI) oder im agorum core Workflow dem Menschen zur Freigabe, Korrektur oder Ablehnung vorgelegt.</w:t>
+        <w:t xml:space="preserve"> Der Vorfall wird in Ihrer Entwicklungsumgebung (</w:t>
+      </w:r>
+      <w:proofErr w:type="spellStart"/>
+      <w:r>
+        <w:rPr>
+          <w:rFonts w:ascii="Arial" w:eastAsia="Times New Roman" w:hAnsi="Arial" w:cs="Arial"/>
+          <w:kern w:val="0"/>
+          <w:lang w:eastAsia="de-DE"/>
+          <w14:ligatures w14:val="none"/>
+        </w:rPr>
+        <w:t>OpenHands</w:t>
+      </w:r>
+      <w:proofErr w:type="spellEnd"/>
+      <w:r>
+        <w:rPr>
+          <w:rFonts w:ascii="Arial" w:eastAsia="Times New Roman" w:hAnsi="Arial" w:cs="Arial"/>
+          <w:kern w:val="0"/>
+          <w:lang w:eastAsia="de-DE"/>
+          <w14:ligatures w14:val="none"/>
+        </w:rPr>
+        <w:t xml:space="preserve"> UI) oder im </w:t>
+      </w:r>
+      <w:proofErr w:type="spellStart"/>
+      <w:r>
+        <w:rPr>
+          <w:rFonts w:ascii="Arial" w:eastAsia="Times New Roman" w:hAnsi="Arial" w:cs="Arial"/>
+          <w:kern w:val="0"/>
+          <w:lang w:eastAsia="de-DE"/>
+          <w14:ligatures w14:val="none"/>
+        </w:rPr>
+        <w:t>agorum</w:t>
+      </w:r>
+      <w:proofErr w:type="spellEnd"/>
+      <w:r>
+        <w:rPr>
+          <w:rFonts w:ascii="Arial" w:eastAsia="Times New Roman" w:hAnsi="Arial" w:cs="Arial"/>
+          <w:kern w:val="0"/>
+          <w:lang w:eastAsia="de-DE"/>
+          <w14:ligatures w14:val="none"/>
+        </w:rPr>
+        <w:t xml:space="preserve"> </w:t>
+      </w:r>
+      <w:proofErr w:type="spellStart"/>
+      <w:r>
+        <w:rPr>
+          <w:rFonts w:ascii="Arial" w:eastAsia="Times New Roman" w:hAnsi="Arial" w:cs="Arial"/>
+          <w:kern w:val="0"/>
+          <w:lang w:eastAsia="de-DE"/>
+          <w14:ligatures w14:val="none"/>
+        </w:rPr>
+        <w:t>core</w:t>
+      </w:r>
+      <w:proofErr w:type="spellEnd"/>
+      <w:r>
+        <w:rPr>
+          <w:rFonts w:ascii="Arial" w:eastAsia="Times New Roman" w:hAnsi="Arial" w:cs="Arial"/>
+          <w:kern w:val="0"/>
+          <w:lang w:eastAsia="de-DE"/>
+          <w14:ligatures w14:val="none"/>
+        </w:rPr>
+        <w:t xml:space="preserve"> Workflow dem Menschen zur Freigabe, Korrektur oder Ablehnung vorgelegt.</w:t>
       </w:r>
     </w:p>
     <w:p>
@@ -604,7 +1337,27 @@
           <w:lang w:eastAsia="de-DE"/>
           <w14:ligatures w14:val="none"/>
         </w:rPr>
-        <w:t xml:space="preserve"> Personenbezogene Daten (PII) werden über ein lokales FastAPI-Gateway automatisiert maskiert oder anonymisiert, bevor Cloud-APIs (wie Claude) angefragt werden.</w:t>
+        <w:t xml:space="preserve"> Personenbezogene Daten (PII) werden über ein lokales </w:t>
+      </w:r>
+      <w:proofErr w:type="spellStart"/>
+      <w:r>
+        <w:rPr>
+          <w:rFonts w:ascii="Arial" w:eastAsia="Times New Roman" w:hAnsi="Arial" w:cs="Arial"/>
+          <w:kern w:val="0"/>
+          <w:lang w:eastAsia="de-DE"/>
+          <w14:ligatures w14:val="none"/>
+        </w:rPr>
+        <w:t>FastAPI</w:t>
+      </w:r>
+      <w:proofErr w:type="spellEnd"/>
+      <w:r>
+        <w:rPr>
+          <w:rFonts w:ascii="Arial" w:eastAsia="Times New Roman" w:hAnsi="Arial" w:cs="Arial"/>
+          <w:kern w:val="0"/>
+          <w:lang w:eastAsia="de-DE"/>
+          <w14:ligatures w14:val="none"/>
+        </w:rPr>
+        <w:t>-Gateway automatisiert maskiert oder anonymisiert, bevor Cloud-APIs (wie Claude) angefragt werden.</w:t>
       </w:r>
     </w:p>
     <w:p>
@@ -659,7 +1412,27 @@
           <w:lang w:eastAsia="de-DE"/>
           <w14:ligatures w14:val="none"/>
         </w:rPr>
-        <w:t xml:space="preserve"> finanzielle/logistische Entscheidungen trifft, fällt er potenziell unter "Hochrisiko"- oder transparenzpflichtige Systeme. Das System benötigt lückenloses Logging.</w:t>
+        <w:t xml:space="preserve"> finanzielle/logistische Entscheidungen trifft, fällt er potenziell unter "Hochrisiko"- oder transparenzpflichtige Systeme. Das System benötigt lückenloses </w:t>
+      </w:r>
+      <w:proofErr w:type="spellStart"/>
+      <w:r>
+        <w:rPr>
+          <w:rFonts w:ascii="Arial" w:eastAsia="Times New Roman" w:hAnsi="Arial" w:cs="Arial"/>
+          <w:kern w:val="0"/>
+          <w:lang w:eastAsia="de-DE"/>
+          <w14:ligatures w14:val="none"/>
+        </w:rPr>
+        <w:t>Logging</w:t>
+      </w:r>
+      <w:proofErr w:type="spellEnd"/>
+      <w:r>
+        <w:rPr>
+          <w:rFonts w:ascii="Arial" w:eastAsia="Times New Roman" w:hAnsi="Arial" w:cs="Arial"/>
+          <w:kern w:val="0"/>
+          <w:lang w:eastAsia="de-DE"/>
+          <w14:ligatures w14:val="none"/>
+        </w:rPr>
+        <w:t>.</w:t>
       </w:r>
     </w:p>
     <w:p>
@@ -695,7 +1468,47 @@
           <w:lang w:eastAsia="de-DE"/>
           <w14:ligatures w14:val="none"/>
         </w:rPr>
-        <w:t xml:space="preserve"> Da Ihr KI-Betriebssystem kritische Business-Infrastruktur steuert, greifen NIS2-Richtlinien für Cybersicherheit. Das System muss Ausfallsicherheit (Serverless Fallbacks) und Incident Reporting bieten.</w:t>
+        <w:t xml:space="preserve"> Da Ihr KI-Betriebssystem kritische Business-Infrastruktur steuert, greifen NIS2-Richtlinien für Cybersicherheit. Das System muss Ausfallsicherheit (</w:t>
+      </w:r>
+      <w:proofErr w:type="spellStart"/>
+      <w:r>
+        <w:rPr>
+          <w:rFonts w:ascii="Arial" w:eastAsia="Times New Roman" w:hAnsi="Arial" w:cs="Arial"/>
+          <w:kern w:val="0"/>
+          <w:lang w:eastAsia="de-DE"/>
+          <w14:ligatures w14:val="none"/>
+        </w:rPr>
+        <w:t>Serverless</w:t>
+      </w:r>
+      <w:proofErr w:type="spellEnd"/>
+      <w:r>
+        <w:rPr>
+          <w:rFonts w:ascii="Arial" w:eastAsia="Times New Roman" w:hAnsi="Arial" w:cs="Arial"/>
+          <w:kern w:val="0"/>
+          <w:lang w:eastAsia="de-DE"/>
+          <w14:ligatures w14:val="none"/>
+        </w:rPr>
+        <w:t xml:space="preserve"> Fallbacks) und </w:t>
+      </w:r>
+      <w:proofErr w:type="spellStart"/>
+      <w:r>
+        <w:rPr>
+          <w:rFonts w:ascii="Arial" w:eastAsia="Times New Roman" w:hAnsi="Arial" w:cs="Arial"/>
+          <w:kern w:val="0"/>
+          <w:lang w:eastAsia="de-DE"/>
+          <w14:ligatures w14:val="none"/>
+        </w:rPr>
+        <w:t>Incident</w:t>
+      </w:r>
+      <w:proofErr w:type="spellEnd"/>
+      <w:r>
+        <w:rPr>
+          <w:rFonts w:ascii="Arial" w:eastAsia="Times New Roman" w:hAnsi="Arial" w:cs="Arial"/>
+          <w:kern w:val="0"/>
+          <w:lang w:eastAsia="de-DE"/>
+          <w14:ligatures w14:val="none"/>
+        </w:rPr>
+        <w:t xml:space="preserve"> Reporting bieten.</w:t>
       </w:r>
     </w:p>
     <w:p>
@@ -754,7 +1567,55 @@
           <w:lang w:eastAsia="de-DE"/>
           <w14:ligatures w14:val="none"/>
         </w:rPr>
-        <w:t>API-Security, Key-Vault, Rotation &amp; Injection-Schutz</w:t>
+        <w:t>API-Security, Key-</w:t>
+      </w:r>
+      <w:proofErr w:type="spellStart"/>
+      <w:r>
+        <w:rPr>
+          <w:rFonts w:ascii="Arial" w:eastAsia="Times New Roman" w:hAnsi="Arial" w:cs="Arial"/>
+          <w:b/>
+          <w:bCs/>
+          <w:kern w:val="0"/>
+          <w:lang w:eastAsia="de-DE"/>
+          <w14:ligatures w14:val="none"/>
+        </w:rPr>
+        <w:t>Vault</w:t>
+      </w:r>
+      <w:proofErr w:type="spellEnd"/>
+      <w:r>
+        <w:rPr>
+          <w:rFonts w:ascii="Arial" w:eastAsia="Times New Roman" w:hAnsi="Arial" w:cs="Arial"/>
+          <w:b/>
+          <w:bCs/>
+          <w:kern w:val="0"/>
+          <w:lang w:eastAsia="de-DE"/>
+          <w14:ligatures w14:val="none"/>
+        </w:rPr>
+        <w:t xml:space="preserve">, Rotation &amp; </w:t>
+      </w:r>
+      <w:proofErr w:type="spellStart"/>
+      <w:r>
+        <w:rPr>
+          <w:rFonts w:ascii="Arial" w:eastAsia="Times New Roman" w:hAnsi="Arial" w:cs="Arial"/>
+          <w:b/>
+          <w:bCs/>
+          <w:kern w:val="0"/>
+          <w:lang w:eastAsia="de-DE"/>
+          <w14:ligatures w14:val="none"/>
+        </w:rPr>
+        <w:t>Injection</w:t>
+      </w:r>
+      <w:proofErr w:type="spellEnd"/>
+      <w:r>
+        <w:rPr>
+          <w:rFonts w:ascii="Arial" w:eastAsia="Times New Roman" w:hAnsi="Arial" w:cs="Arial"/>
+          <w:b/>
+          <w:bCs/>
+          <w:kern w:val="0"/>
+          <w:lang w:eastAsia="de-DE"/>
+          <w14:ligatures w14:val="none"/>
+        </w:rPr>
+        <w:t>-Schutz</w:t>
       </w:r>
     </w:p>
     <w:p>
@@ -780,16 +1641,50 @@
           <w:lang w:eastAsia="de-DE"/>
           <w14:ligatures w14:val="none"/>
         </w:rPr>
-        <w:t>Sicherer Vault &amp; Rotation:</w:t>
-      </w:r>
-      <w:r>
-        <w:rPr>
-          <w:rFonts w:ascii="Arial" w:eastAsia="Times New Roman" w:hAnsi="Arial" w:cs="Arial"/>
-          <w:kern w:val="0"/>
-          <w:lang w:eastAsia="de-DE"/>
-          <w14:ligatures w14:val="none"/>
-        </w:rPr>
-        <w:t xml:space="preserve"> API-Schlüssel liegen niemals als Klartext in </w:t>
+        <w:t xml:space="preserve">Sicherer </w:t>
+      </w:r>
+      <w:proofErr w:type="spellStart"/>
+      <w:r>
+        <w:rPr>
+          <w:rFonts w:ascii="Arial" w:eastAsia="Times New Roman" w:hAnsi="Arial" w:cs="Arial"/>
+          <w:b/>
+          <w:bCs/>
+          <w:kern w:val="0"/>
+          <w:lang w:eastAsia="de-DE"/>
+          <w14:ligatures w14:val="none"/>
+        </w:rPr>
+        <w:t>Vault</w:t>
+      </w:r>
+      <w:proofErr w:type="spellEnd"/>
+      <w:r>
+        <w:rPr>
+          <w:rFonts w:ascii="Arial" w:eastAsia="Times New Roman" w:hAnsi="Arial" w:cs="Arial"/>
+          <w:b/>
+          <w:bCs/>
+          <w:kern w:val="0"/>
+          <w:lang w:eastAsia="de-DE"/>
+          <w14:ligatures w14:val="none"/>
+        </w:rPr>
+        <w:t xml:space="preserve"> &amp; Rotation:</w:t>
+      </w:r>
+      <w:r>
+        <w:rPr>
+          <w:rFonts w:ascii="Arial" w:eastAsia="Times New Roman" w:hAnsi="Arial" w:cs="Arial"/>
+          <w:kern w:val="0"/>
+          <w:lang w:eastAsia="de-DE"/>
+          <w14:ligatures w14:val="none"/>
+        </w:rPr>
+        <w:t xml:space="preserve"> API-Schlüssel liegen niemals als Klartext </w:t>
+      </w:r>
+      <w:proofErr w:type="gramStart"/>
+      <w:r>
+        <w:rPr>
+          <w:rFonts w:ascii="Arial" w:eastAsia="Times New Roman" w:hAnsi="Arial" w:cs="Arial"/>
+          <w:kern w:val="0"/>
+          <w:lang w:eastAsia="de-DE"/>
+          <w14:ligatures w14:val="none"/>
+        </w:rPr>
+        <w:t xml:space="preserve">in </w:t>
       </w:r>
       <w:r>
         <w:rPr>
@@ -800,17 +1695,52 @@
           <w:lang w:eastAsia="de-DE"/>
           <w14:ligatures w14:val="none"/>
         </w:rPr>
-        <w:t>.env</w:t>
-      </w:r>
-      <w:r>
-        <w:rPr>
-          <w:rFonts w:ascii="Arial" w:eastAsia="Times New Roman" w:hAnsi="Arial" w:cs="Arial"/>
-          <w:kern w:val="0"/>
-          <w:lang w:eastAsia="de-DE"/>
-          <w14:ligatures w14:val="none"/>
-        </w:rPr>
-        <w:t xml:space="preserve">-Dateien, sondern werden verschlüsselt in einem Vault (z. B. </w:t>
-      </w:r>
+        <w:t>.</w:t>
+      </w:r>
+      <w:proofErr w:type="spellStart"/>
+      <w:r>
+        <w:rPr>
+          <w:rFonts w:ascii="Courier New" w:eastAsia="Times New Roman" w:hAnsi="Courier New" w:cs="Courier New"/>
+          <w:kern w:val="0"/>
+          <w:sz w:val="21"/>
+          <w:szCs w:val="21"/>
+          <w:lang w:eastAsia="de-DE"/>
+          <w14:ligatures w14:val="none"/>
+        </w:rPr>
+        <w:t>env</w:t>
+      </w:r>
+      <w:proofErr w:type="spellEnd"/>
+      <w:proofErr w:type="gramEnd"/>
+      <w:r>
+        <w:rPr>
+          <w:rFonts w:ascii="Arial" w:eastAsia="Times New Roman" w:hAnsi="Arial" w:cs="Arial"/>
+          <w:kern w:val="0"/>
+          <w:lang w:eastAsia="de-DE"/>
+          <w14:ligatures w14:val="none"/>
+        </w:rPr>
+        <w:t xml:space="preserve">-Dateien, sondern werden verschlüsselt in einem </w:t>
+      </w:r>
+      <w:proofErr w:type="spellStart"/>
+      <w:r>
+        <w:rPr>
+          <w:rFonts w:ascii="Arial" w:eastAsia="Times New Roman" w:hAnsi="Arial" w:cs="Arial"/>
+          <w:kern w:val="0"/>
+          <w:lang w:eastAsia="de-DE"/>
+          <w14:ligatures w14:val="none"/>
+        </w:rPr>
+        <w:t>Vault</w:t>
+      </w:r>
+      <w:proofErr w:type="spellEnd"/>
+      <w:r>
+        <w:rPr>
+          <w:rFonts w:ascii="Arial" w:eastAsia="Times New Roman" w:hAnsi="Arial" w:cs="Arial"/>
+          <w:kern w:val="0"/>
+          <w:lang w:eastAsia="de-DE"/>
+          <w14:ligatures w14:val="none"/>
+        </w:rPr>
+        <w:t xml:space="preserve"> (z. B. </w:t>
+      </w:r>
+      <w:proofErr w:type="spellStart"/>
       <w:r>
         <w:rPr>
           <w:rFonts w:ascii="Arial" w:eastAsia="Times New Roman" w:hAnsi="Arial" w:cs="Arial"/>
@@ -820,17 +1750,9 @@
           <w:lang w:eastAsia="de-DE"/>
           <w14:ligatures w14:val="none"/>
         </w:rPr>
-        <w:t>HashiCorp Vault</w:t>
-      </w:r>
-      <w:r>
-        <w:rPr>
-          <w:rFonts w:ascii="Arial" w:eastAsia="Times New Roman" w:hAnsi="Arial" w:cs="Arial"/>
-          <w:kern w:val="0"/>
-          <w:lang w:eastAsia="de-DE"/>
-          <w14:ligatures w14:val="none"/>
-        </w:rPr>
-        <w:t xml:space="preserve"> oder </w:t>
-      </w:r>
+        <w:t>HashiCorp</w:t>
+      </w:r>
+      <w:proofErr w:type="spellEnd"/>
       <w:r>
         <w:rPr>
           <w:rFonts w:ascii="Arial" w:eastAsia="Times New Roman" w:hAnsi="Arial" w:cs="Arial"/>
@@ -840,8 +1762,43 @@
           <w:lang w:eastAsia="de-DE"/>
           <w14:ligatures w14:val="none"/>
         </w:rPr>
+        <w:t xml:space="preserve"> </w:t>
+      </w:r>
+      <w:proofErr w:type="spellStart"/>
+      <w:r>
+        <w:rPr>
+          <w:rFonts w:ascii="Arial" w:eastAsia="Times New Roman" w:hAnsi="Arial" w:cs="Arial"/>
+          <w:i/>
+          <w:iCs/>
+          <w:kern w:val="0"/>
+          <w:lang w:eastAsia="de-DE"/>
+          <w14:ligatures w14:val="none"/>
+        </w:rPr>
+        <w:t>Vault</w:t>
+      </w:r>
+      <w:proofErr w:type="spellEnd"/>
+      <w:r>
+        <w:rPr>
+          <w:rFonts w:ascii="Arial" w:eastAsia="Times New Roman" w:hAnsi="Arial" w:cs="Arial"/>
+          <w:kern w:val="0"/>
+          <w:lang w:eastAsia="de-DE"/>
+          <w14:ligatures w14:val="none"/>
+        </w:rPr>
+        <w:t xml:space="preserve"> oder </w:t>
+      </w:r>
+      <w:proofErr w:type="spellStart"/>
+      <w:r>
+        <w:rPr>
+          <w:rFonts w:ascii="Arial" w:eastAsia="Times New Roman" w:hAnsi="Arial" w:cs="Arial"/>
+          <w:i/>
+          <w:iCs/>
+          <w:kern w:val="0"/>
+          <w:lang w:eastAsia="de-DE"/>
+          <w14:ligatures w14:val="none"/>
+        </w:rPr>
         <w:t>Infisical</w:t>
       </w:r>
+      <w:proofErr w:type="spellEnd"/>
       <w:r>
         <w:rPr>
           <w:rFonts w:ascii="Arial" w:eastAsia="Times New Roman" w:hAnsi="Arial" w:cs="Arial"/>
@@ -875,16 +1832,164 @@
           <w:lang w:eastAsia="de-DE"/>
           <w14:ligatures w14:val="none"/>
         </w:rPr>
-        <w:t>Rate Limiting &amp; Cost Control:</w:t>
-      </w:r>
-      <w:r>
-        <w:rPr>
-          <w:rFonts w:ascii="Arial" w:eastAsia="Times New Roman" w:hAnsi="Arial" w:cs="Arial"/>
-          <w:kern w:val="0"/>
-          <w:lang w:eastAsia="de-DE"/>
-          <w14:ligatures w14:val="none"/>
-        </w:rPr>
-        <w:t xml:space="preserve"> Das FastAPI-Gateway limitiert Anfragen pro Agent/Nutzer, um Denial-of-Service-Angriffe (DoS) oder astronomische API-Kosten durch Endlosschleifen zu verhindern.</w:t>
+        <w:t xml:space="preserve">Rate </w:t>
+      </w:r>
+      <w:proofErr w:type="spellStart"/>
+      <w:r>
+        <w:rPr>
+          <w:rFonts w:ascii="Arial" w:eastAsia="Times New Roman" w:hAnsi="Arial" w:cs="Arial"/>
+          <w:b/>
+          <w:bCs/>
+          <w:kern w:val="0"/>
+          <w:lang w:eastAsia="de-DE"/>
+          <w14:ligatures w14:val="none"/>
+        </w:rPr>
+        <w:t>Limiting</w:t>
+      </w:r>
+      <w:proofErr w:type="spellEnd"/>
+      <w:r>
+        <w:rPr>
+          <w:rFonts w:ascii="Arial" w:eastAsia="Times New Roman" w:hAnsi="Arial" w:cs="Arial"/>
+          <w:b/>
+          <w:bCs/>
+          <w:kern w:val="0"/>
+          <w:lang w:eastAsia="de-DE"/>
+          <w14:ligatures w14:val="none"/>
+        </w:rPr>
+        <w:t xml:space="preserve"> &amp; </w:t>
+      </w:r>
+      <w:proofErr w:type="spellStart"/>
+      <w:r>
+        <w:rPr>
+          <w:rFonts w:ascii="Arial" w:eastAsia="Times New Roman" w:hAnsi="Arial" w:cs="Arial"/>
+          <w:b/>
+          <w:bCs/>
+          <w:kern w:val="0"/>
+          <w:lang w:eastAsia="de-DE"/>
+          <w14:ligatures w14:val="none"/>
+        </w:rPr>
+        <w:t>Cost</w:t>
+      </w:r>
+      <w:proofErr w:type="spellEnd"/>
+      <w:r>
+        <w:rPr>
+          <w:rFonts w:ascii="Arial" w:eastAsia="Times New Roman" w:hAnsi="Arial" w:cs="Arial"/>
+          <w:b/>
+          <w:bCs/>
+          <w:kern w:val="0"/>
+          <w:lang w:eastAsia="de-DE"/>
+          <w14:ligatures w14:val="none"/>
+        </w:rPr>
+        <w:t xml:space="preserve"> Control:</w:t>
+      </w:r>
+      <w:r>
+        <w:rPr>
+          <w:rFonts w:ascii="Arial" w:eastAsia="Times New Roman" w:hAnsi="Arial" w:cs="Arial"/>
+          <w:kern w:val="0"/>
+          <w:lang w:eastAsia="de-DE"/>
+          <w14:ligatures w14:val="none"/>
+        </w:rPr>
+        <w:t xml:space="preserve"> Das </w:t>
+      </w:r>
+      <w:proofErr w:type="spellStart"/>
+      <w:r>
+        <w:rPr>
+          <w:rFonts w:ascii="Arial" w:eastAsia="Times New Roman" w:hAnsi="Arial" w:cs="Arial"/>
+          <w:kern w:val="0"/>
+          <w:lang w:eastAsia="de-DE"/>
+          <w14:ligatures w14:val="none"/>
+        </w:rPr>
+        <w:t>FastAPI</w:t>
+      </w:r>
+      <w:proofErr w:type="spellEnd"/>
+      <w:r>
+        <w:rPr>
+          <w:rFonts w:ascii="Arial" w:eastAsia="Times New Roman" w:hAnsi="Arial" w:cs="Arial"/>
+          <w:kern w:val="0"/>
+          <w:lang w:eastAsia="de-DE"/>
+          <w14:ligatures w14:val="none"/>
+        </w:rPr>
+        <w:t xml:space="preserve">-Gateway limitiert Anfragen </w:t>
+      </w:r>
+      <w:proofErr w:type="gramStart"/>
+      <w:r>
+        <w:rPr>
+          <w:rFonts w:ascii="Arial" w:eastAsia="Times New Roman" w:hAnsi="Arial" w:cs="Arial"/>
+          <w:kern w:val="0"/>
+          <w:lang w:eastAsia="de-DE"/>
+          <w14:ligatures w14:val="none"/>
+        </w:rPr>
+        <w:t>pro Agent</w:t>
+      </w:r>
+      <w:proofErr w:type="gramEnd"/>
+      <w:r>
+        <w:rPr>
+          <w:rFonts w:ascii="Arial" w:eastAsia="Times New Roman" w:hAnsi="Arial" w:cs="Arial"/>
+          <w:kern w:val="0"/>
+          <w:lang w:eastAsia="de-DE"/>
+          <w14:ligatures w14:val="none"/>
+        </w:rPr>
+        <w:t xml:space="preserve">/Nutzer, um </w:t>
+      </w:r>
+      <w:proofErr w:type="spellStart"/>
+      <w:r>
+        <w:rPr>
+          <w:rFonts w:ascii="Arial" w:eastAsia="Times New Roman" w:hAnsi="Arial" w:cs="Arial"/>
+          <w:kern w:val="0"/>
+          <w:lang w:eastAsia="de-DE"/>
+          <w14:ligatures w14:val="none"/>
+        </w:rPr>
+        <w:t>Denial</w:t>
+      </w:r>
+      <w:proofErr w:type="spellEnd"/>
+      <w:r>
+        <w:rPr>
+          <w:rFonts w:ascii="Arial" w:eastAsia="Times New Roman" w:hAnsi="Arial" w:cs="Arial"/>
+          <w:kern w:val="0"/>
+          <w:lang w:eastAsia="de-DE"/>
+          <w14:ligatures w14:val="none"/>
+        </w:rPr>
+        <w:t>-</w:t>
+      </w:r>
+      <w:proofErr w:type="spellStart"/>
+      <w:r>
+        <w:rPr>
+          <w:rFonts w:ascii="Arial" w:eastAsia="Times New Roman" w:hAnsi="Arial" w:cs="Arial"/>
+          <w:kern w:val="0"/>
+          <w:lang w:eastAsia="de-DE"/>
+          <w14:ligatures w14:val="none"/>
+        </w:rPr>
+        <w:t>of</w:t>
+      </w:r>
+      <w:proofErr w:type="spellEnd"/>
+      <w:r>
+        <w:rPr>
+          <w:rFonts w:ascii="Arial" w:eastAsia="Times New Roman" w:hAnsi="Arial" w:cs="Arial"/>
+          <w:kern w:val="0"/>
+          <w:lang w:eastAsia="de-DE"/>
+          <w14:ligatures w14:val="none"/>
+        </w:rPr>
+        <w:t>-Service-Angriffe (</w:t>
+      </w:r>
+      <w:proofErr w:type="spellStart"/>
+      <w:r>
+        <w:rPr>
+          <w:rFonts w:ascii="Arial" w:eastAsia="Times New Roman" w:hAnsi="Arial" w:cs="Arial"/>
+          <w:kern w:val="0"/>
+          <w:lang w:eastAsia="de-DE"/>
+          <w14:ligatures w14:val="none"/>
+        </w:rPr>
+        <w:t>DoS</w:t>
+      </w:r>
+      <w:proofErr w:type="spellEnd"/>
+      <w:r>
+        <w:rPr>
+          <w:rFonts w:ascii="Arial" w:eastAsia="Times New Roman" w:hAnsi="Arial" w:cs="Arial"/>
+          <w:kern w:val="0"/>
+          <w:lang w:eastAsia="de-DE"/>
+          <w14:ligatures w14:val="none"/>
+        </w:rPr>
+        <w:t>) oder astronomische API-Kosten durch Endlosschleifen zu verhindern.</w:t>
       </w:r>
     </w:p>
     <w:p>
@@ -910,17 +2015,62 @@
           <w:lang w:eastAsia="de-DE"/>
           <w14:ligatures w14:val="none"/>
         </w:rPr>
-        <w:t>Prompt Injection Defense:</w:t>
-      </w:r>
-      <w:r>
-        <w:rPr>
-          <w:rFonts w:ascii="Arial" w:eastAsia="Times New Roman" w:hAnsi="Arial" w:cs="Arial"/>
-          <w:kern w:val="0"/>
-          <w:lang w:eastAsia="de-DE"/>
-          <w14:ligatures w14:val="none"/>
-        </w:rPr>
-        <w:t xml:space="preserve"> Ein zweistufiger Filter (Eingangs- und Ausgangskontrolle). Jede Benutzereingabe läuft vorab durch ein spezialisiertes Guardrail-Modell (z. B. </w:t>
-      </w:r>
+        <w:t xml:space="preserve">Prompt </w:t>
+      </w:r>
+      <w:proofErr w:type="spellStart"/>
+      <w:r>
+        <w:rPr>
+          <w:rFonts w:ascii="Arial" w:eastAsia="Times New Roman" w:hAnsi="Arial" w:cs="Arial"/>
+          <w:b/>
+          <w:bCs/>
+          <w:kern w:val="0"/>
+          <w:lang w:eastAsia="de-DE"/>
+          <w14:ligatures w14:val="none"/>
+        </w:rPr>
+        <w:t>Injection</w:t>
+      </w:r>
+      <w:proofErr w:type="spellEnd"/>
+      <w:r>
+        <w:rPr>
+          <w:rFonts w:ascii="Arial" w:eastAsia="Times New Roman" w:hAnsi="Arial" w:cs="Arial"/>
+          <w:b/>
+          <w:bCs/>
+          <w:kern w:val="0"/>
+          <w:lang w:eastAsia="de-DE"/>
+          <w14:ligatures w14:val="none"/>
+        </w:rPr>
+        <w:t xml:space="preserve"> Defense:</w:t>
+      </w:r>
+      <w:r>
+        <w:rPr>
+          <w:rFonts w:ascii="Arial" w:eastAsia="Times New Roman" w:hAnsi="Arial" w:cs="Arial"/>
+          <w:kern w:val="0"/>
+          <w:lang w:eastAsia="de-DE"/>
+          <w14:ligatures w14:val="none"/>
+        </w:rPr>
+        <w:t xml:space="preserve"> Ein zweistufiger Filter (Eingangs- und Ausgangskontrolle). Jede Benutzereingabe läuft vorab durch ein spezialisiertes </w:t>
+      </w:r>
+      <w:proofErr w:type="spellStart"/>
+      <w:r>
+        <w:rPr>
+          <w:rFonts w:ascii="Arial" w:eastAsia="Times New Roman" w:hAnsi="Arial" w:cs="Arial"/>
+          <w:kern w:val="0"/>
+          <w:lang w:eastAsia="de-DE"/>
+          <w14:ligatures w14:val="none"/>
+        </w:rPr>
+        <w:t>Guardrail</w:t>
+      </w:r>
+      <w:proofErr w:type="spellEnd"/>
+      <w:r>
+        <w:rPr>
+          <w:rFonts w:ascii="Arial" w:eastAsia="Times New Roman" w:hAnsi="Arial" w:cs="Arial"/>
+          <w:kern w:val="0"/>
+          <w:lang w:eastAsia="de-DE"/>
+          <w14:ligatures w14:val="none"/>
+        </w:rPr>
+        <w:t xml:space="preserve">-Modell (z. B. </w:t>
+      </w:r>
+      <w:proofErr w:type="spellStart"/>
       <w:r>
         <w:rPr>
           <w:rFonts w:ascii="Arial" w:eastAsia="Times New Roman" w:hAnsi="Arial" w:cs="Arial"/>
@@ -930,17 +2080,9 @@
           <w:lang w:eastAsia="de-DE"/>
           <w14:ligatures w14:val="none"/>
         </w:rPr>
-        <w:t>Llama Guard</w:t>
-      </w:r>
-      <w:r>
-        <w:rPr>
-          <w:rFonts w:ascii="Arial" w:eastAsia="Times New Roman" w:hAnsi="Arial" w:cs="Arial"/>
-          <w:kern w:val="0"/>
-          <w:lang w:eastAsia="de-DE"/>
-          <w14:ligatures w14:val="none"/>
-        </w:rPr>
-        <w:t xml:space="preserve"> oder </w:t>
-      </w:r>
+        <w:t>Llama</w:t>
+      </w:r>
+      <w:proofErr w:type="spellEnd"/>
       <w:r>
         <w:rPr>
           <w:rFonts w:ascii="Arial" w:eastAsia="Times New Roman" w:hAnsi="Arial" w:cs="Arial"/>
@@ -950,8 +2092,67 @@
           <w:lang w:eastAsia="de-DE"/>
           <w14:ligatures w14:val="none"/>
         </w:rPr>
-        <w:t>NeMo Guardrails</w:t>
-      </w:r>
+        <w:t xml:space="preserve"> </w:t>
+      </w:r>
+      <w:proofErr w:type="spellStart"/>
+      <w:r>
+        <w:rPr>
+          <w:rFonts w:ascii="Arial" w:eastAsia="Times New Roman" w:hAnsi="Arial" w:cs="Arial"/>
+          <w:i/>
+          <w:iCs/>
+          <w:kern w:val="0"/>
+          <w:lang w:eastAsia="de-DE"/>
+          <w14:ligatures w14:val="none"/>
+        </w:rPr>
+        <w:t>Guard</w:t>
+      </w:r>
+      <w:proofErr w:type="spellEnd"/>
+      <w:r>
+        <w:rPr>
+          <w:rFonts w:ascii="Arial" w:eastAsia="Times New Roman" w:hAnsi="Arial" w:cs="Arial"/>
+          <w:kern w:val="0"/>
+          <w:lang w:eastAsia="de-DE"/>
+          <w14:ligatures w14:val="none"/>
+        </w:rPr>
+        <w:t xml:space="preserve"> oder </w:t>
+      </w:r>
+      <w:proofErr w:type="spellStart"/>
+      <w:r>
+        <w:rPr>
+          <w:rFonts w:ascii="Arial" w:eastAsia="Times New Roman" w:hAnsi="Arial" w:cs="Arial"/>
+          <w:i/>
+          <w:iCs/>
+          <w:kern w:val="0"/>
+          <w:lang w:eastAsia="de-DE"/>
+          <w14:ligatures w14:val="none"/>
+        </w:rPr>
+        <w:t>NeMo</w:t>
+      </w:r>
+      <w:proofErr w:type="spellEnd"/>
+      <w:r>
+        <w:rPr>
+          <w:rFonts w:ascii="Arial" w:eastAsia="Times New Roman" w:hAnsi="Arial" w:cs="Arial"/>
+          <w:i/>
+          <w:iCs/>
+          <w:kern w:val="0"/>
+          <w:lang w:eastAsia="de-DE"/>
+          <w14:ligatures w14:val="none"/>
+        </w:rPr>
+        <w:t xml:space="preserve"> </w:t>
+      </w:r>
+      <w:proofErr w:type="spellStart"/>
+      <w:r>
+        <w:rPr>
+          <w:rFonts w:ascii="Arial" w:eastAsia="Times New Roman" w:hAnsi="Arial" w:cs="Arial"/>
+          <w:i/>
+          <w:iCs/>
+          <w:kern w:val="0"/>
+          <w:lang w:eastAsia="de-DE"/>
+          <w14:ligatures w14:val="none"/>
+        </w:rPr>
+        <w:t>Guardrails</w:t>
+      </w:r>
+      <w:proofErr w:type="spellEnd"/>
       <w:r>
         <w:rPr>
           <w:rFonts w:ascii="Arial" w:eastAsia="Times New Roman" w:hAnsi="Arial" w:cs="Arial"/>
@@ -1023,27 +2224,1724 @@
     </w:p>
     <w:p>
       <w:r>
-        <w:t>- Agent-Harnesses selbst bauen.</w:t>
+        <w:t>- Agent-</w:t>
+      </w:r>
+      <w:proofErr w:type="spellStart"/>
+      <w:r>
+        <w:t>Harnesses</w:t>
+      </w:r>
+      <w:proofErr w:type="spellEnd"/>
+      <w:r>
+        <w:t xml:space="preserve"> selbst bauen.</w:t>
       </w:r>
     </w:p>
     <w:p>
       <w:r>
-        <w:t>- Konzept: Agenst.md Skill,</w:t>
+        <w:t xml:space="preserve">- Konzept: Agenst.md </w:t>
+      </w:r>
+      <w:proofErr w:type="spellStart"/>
+      <w:r>
+        <w:t>Skill</w:t>
+      </w:r>
+      <w:proofErr w:type="spellEnd"/>
+      <w:r>
+        <w:t>,</w:t>
       </w:r>
     </w:p>
     <w:p>
       <w:r>
-        <w:t xml:space="preserve">- Projekt: Web-Erweiterung bauen (AIVO-GEO Leads Automation) </w:t>
-      </w:r>
-      <w:r>
-        <w:t>, youtube Business etc…</w:t>
+        <w:t>- Projekt: Web-Erweiterung bauen (AIVO-GEO Leads Automation</w:t>
+      </w:r>
+      <w:proofErr w:type="gramStart"/>
+      <w:r>
+        <w:t xml:space="preserve">) </w:t>
+      </w:r>
+      <w:r>
+        <w:t>,</w:t>
+      </w:r>
+      <w:proofErr w:type="gramEnd"/>
+      <w:r>
+        <w:t xml:space="preserve"> </w:t>
+      </w:r>
+      <w:proofErr w:type="spellStart"/>
+      <w:r>
+        <w:t>youtube</w:t>
+      </w:r>
+      <w:proofErr w:type="spellEnd"/>
+      <w:r>
+        <w:t xml:space="preserve"> Business etc…</w:t>
       </w:r>
     </w:p>
     <w:p>
-      <w:r>
-        <w:t>- Welche Agentic Coding Assistent passen zu unser Plan: Claude Code, Openhands, Langgraph, Hermers, Open Claw, Clin, Ollama, etc? Denn wir brauchen für unser KI Fabrik der CEO/Manager der das ganze Fabrik bauen und Verwaltung/Management übernehmen können.</w:t>
+      <w:pPr>
+        <w:pBdr>
+          <w:bottom w:val="single" w:sz="6" w:space="1" w:color="auto"/>
+        </w:pBdr>
+      </w:pPr>
+      <w:r>
+        <w:t xml:space="preserve">- Welche </w:t>
+      </w:r>
+      <w:proofErr w:type="spellStart"/>
+      <w:r>
+        <w:t>Agentic</w:t>
+      </w:r>
+      <w:proofErr w:type="spellEnd"/>
+      <w:r>
+        <w:t xml:space="preserve"> Coding Assistent passen </w:t>
+      </w:r>
+      <w:proofErr w:type="gramStart"/>
+      <w:r>
+        <w:t>zu unser Plan</w:t>
+      </w:r>
+      <w:proofErr w:type="gramEnd"/>
+      <w:r>
+        <w:t xml:space="preserve">: Claude Code, </w:t>
+      </w:r>
+      <w:proofErr w:type="spellStart"/>
+      <w:r>
+        <w:t>Openhands</w:t>
+      </w:r>
+      <w:proofErr w:type="spellEnd"/>
+      <w:r>
+        <w:t xml:space="preserve">, Langgraph, </w:t>
+      </w:r>
+      <w:proofErr w:type="spellStart"/>
+      <w:r>
+        <w:t>Hermers</w:t>
+      </w:r>
+      <w:proofErr w:type="spellEnd"/>
+      <w:r>
+        <w:t xml:space="preserve">, Open </w:t>
+      </w:r>
+      <w:proofErr w:type="spellStart"/>
+      <w:r>
+        <w:t>Claw</w:t>
+      </w:r>
+      <w:proofErr w:type="spellEnd"/>
+      <w:r>
+        <w:t xml:space="preserve">, </w:t>
+      </w:r>
+      <w:proofErr w:type="spellStart"/>
+      <w:r>
+        <w:t>Clin</w:t>
+      </w:r>
+      <w:proofErr w:type="spellEnd"/>
+      <w:r>
+        <w:t xml:space="preserve">, </w:t>
+      </w:r>
+      <w:proofErr w:type="spellStart"/>
+      <w:r>
+        <w:t>Ollama</w:t>
+      </w:r>
+      <w:proofErr w:type="spellEnd"/>
+      <w:r>
+        <w:t xml:space="preserve">, </w:t>
+      </w:r>
+      <w:proofErr w:type="spellStart"/>
+      <w:r>
+        <w:t>etc</w:t>
+      </w:r>
+      <w:proofErr w:type="spellEnd"/>
+      <w:r>
+        <w:t xml:space="preserve">? Denn wir brauchen für unser </w:t>
+      </w:r>
+      <w:proofErr w:type="gramStart"/>
+      <w:r>
+        <w:t>KI Fabrik</w:t>
+      </w:r>
+      <w:proofErr w:type="gramEnd"/>
+      <w:r>
+        <w:t xml:space="preserve"> der CEO/Manager der das ganze Fabrik bauen und Verwaltung/Management übernehmen können.</w:t>
       </w:r>
     </w:p>
+    <w:p/>
+    <w:p>
+      <w:r>
+        <w:rPr>
+          <w:b/>
+          <w:bCs/>
+        </w:rPr>
+        <w:t>Claude Code</w:t>
+      </w:r>
+      <w:r>
+        <w:t xml:space="preserve"> ist derzeit das führende Tool für terminalbasiertes, autonomes Coding. Der Markt für KI-Entwickler-Tools unterscheidet sich jedoch stark nach Architektur (CLI-Tools, Agenten-Frameworks oder eigenständige UI-Plattformen) und Offenheit des Quellcodes. [1, 2, 3, 4, 5] </w:t>
+      </w:r>
+    </w:p>
+    <w:p>
+      <w:r>
+        <w:t>Hier ist der direkte Vergleich von Claude Code mit Ihren genannten Tools und den aktuell besten Alternativen.</w:t>
+      </w:r>
+    </w:p>
+    <w:p>
+      <w:r>
+        <w:pict w14:anchorId="56BA9759">
+          <v:rect id="_x0000_i1045" style="width:0;height:.75pt" o:hralign="center" o:hrstd="t" o:hr="t" fillcolor="#a0a0a0" stroked="f"/>
+        </w:pict>
+      </w:r>
+    </w:p>
+    <w:p>
+      <w:pPr>
+        <w:rPr>
+          <w:b/>
+          <w:bCs/>
+        </w:rPr>
+      </w:pPr>
+      <w:r>
+        <w:rPr>
+          <w:b/>
+          <w:bCs/>
+        </w:rPr>
+        <w:lastRenderedPageBreak/>
+        <w:t>Direktvergleich der Tools</w:t>
+      </w:r>
+    </w:p>
+    <w:tbl>
+      <w:tblPr>
+        <w:tblW w:w="5000" w:type="pct"/>
+        <w:tblCellMar>
+          <w:top w:w="15" w:type="dxa"/>
+          <w:left w:w="15" w:type="dxa"/>
+          <w:bottom w:w="15" w:type="dxa"/>
+          <w:right w:w="15" w:type="dxa"/>
+        </w:tblCellMar>
+        <w:tblLook w:val="04A0" w:firstRow="1" w:lastRow="0" w:firstColumn="1" w:lastColumn="0" w:noHBand="0" w:noVBand="1"/>
+      </w:tblPr>
+      <w:tblGrid>
+        <w:gridCol w:w="1529"/>
+        <w:gridCol w:w="1385"/>
+        <w:gridCol w:w="2200"/>
+        <w:gridCol w:w="1912"/>
+        <w:gridCol w:w="2026"/>
+      </w:tblGrid>
+      <w:tr>
+        <w:tc>
+          <w:tcPr>
+            <w:tcW w:w="0" w:type="auto"/>
+            <w:tcBorders>
+              <w:top w:val="single" w:sz="8" w:space="0" w:color="000000"/>
+              <w:left w:val="single" w:sz="8" w:space="0" w:color="000000"/>
+              <w:bottom w:val="single" w:sz="8" w:space="0" w:color="000000"/>
+              <w:right w:val="single" w:sz="8" w:space="0" w:color="000000"/>
+            </w:tcBorders>
+            <w:tcMar>
+              <w:top w:w="100" w:type="dxa"/>
+              <w:left w:w="100" w:type="dxa"/>
+              <w:bottom w:w="100" w:type="dxa"/>
+              <w:right w:w="100" w:type="dxa"/>
+            </w:tcMar>
+            <w:hideMark/>
+          </w:tcPr>
+          <w:p>
+            <w:pPr>
+              <w:rPr>
+                <w:b/>
+                <w:bCs/>
+              </w:rPr>
+            </w:pPr>
+            <w:r>
+              <w:rPr>
+                <w:b/>
+                <w:bCs/>
+              </w:rPr>
+              <w:t xml:space="preserve">Tool / Modell [2, 6, 7, 8, 9, 10, 11, 12, 13, 14, 15, 16] </w:t>
+            </w:r>
+          </w:p>
+        </w:tc>
+        <w:tc>
+          <w:tcPr>
+            <w:tcW w:w="0" w:type="auto"/>
+            <w:tcBorders>
+              <w:top w:val="single" w:sz="8" w:space="0" w:color="000000"/>
+              <w:left w:val="single" w:sz="8" w:space="0" w:color="000000"/>
+              <w:bottom w:val="single" w:sz="8" w:space="0" w:color="000000"/>
+              <w:right w:val="single" w:sz="8" w:space="0" w:color="000000"/>
+            </w:tcBorders>
+            <w:tcMar>
+              <w:top w:w="100" w:type="dxa"/>
+              <w:left w:w="100" w:type="dxa"/>
+              <w:bottom w:w="100" w:type="dxa"/>
+              <w:right w:w="100" w:type="dxa"/>
+            </w:tcMar>
+            <w:hideMark/>
+          </w:tcPr>
+          <w:p>
+            <w:pPr>
+              <w:rPr>
+                <w:b/>
+                <w:bCs/>
+              </w:rPr>
+            </w:pPr>
+            <w:r>
+              <w:rPr>
+                <w:b/>
+                <w:bCs/>
+              </w:rPr>
+              <w:t>Typ</w:t>
+            </w:r>
+          </w:p>
+        </w:tc>
+        <w:tc>
+          <w:tcPr>
+            <w:tcW w:w="0" w:type="auto"/>
+            <w:tcBorders>
+              <w:top w:val="single" w:sz="8" w:space="0" w:color="000000"/>
+              <w:left w:val="single" w:sz="8" w:space="0" w:color="000000"/>
+              <w:bottom w:val="single" w:sz="8" w:space="0" w:color="000000"/>
+              <w:right w:val="single" w:sz="8" w:space="0" w:color="000000"/>
+            </w:tcBorders>
+            <w:tcMar>
+              <w:top w:w="100" w:type="dxa"/>
+              <w:left w:w="100" w:type="dxa"/>
+              <w:bottom w:w="100" w:type="dxa"/>
+              <w:right w:w="100" w:type="dxa"/>
+            </w:tcMar>
+            <w:hideMark/>
+          </w:tcPr>
+          <w:p>
+            <w:pPr>
+              <w:rPr>
+                <w:b/>
+                <w:bCs/>
+              </w:rPr>
+            </w:pPr>
+            <w:r>
+              <w:rPr>
+                <w:b/>
+                <w:bCs/>
+              </w:rPr>
+              <w:t>Stärken</w:t>
+            </w:r>
+          </w:p>
+        </w:tc>
+        <w:tc>
+          <w:tcPr>
+            <w:tcW w:w="0" w:type="auto"/>
+            <w:tcBorders>
+              <w:top w:val="single" w:sz="8" w:space="0" w:color="000000"/>
+              <w:left w:val="single" w:sz="8" w:space="0" w:color="000000"/>
+              <w:bottom w:val="single" w:sz="8" w:space="0" w:color="000000"/>
+              <w:right w:val="single" w:sz="8" w:space="0" w:color="000000"/>
+            </w:tcBorders>
+            <w:tcMar>
+              <w:top w:w="100" w:type="dxa"/>
+              <w:left w:w="100" w:type="dxa"/>
+              <w:bottom w:w="100" w:type="dxa"/>
+              <w:right w:w="100" w:type="dxa"/>
+            </w:tcMar>
+            <w:hideMark/>
+          </w:tcPr>
+          <w:p>
+            <w:pPr>
+              <w:rPr>
+                <w:b/>
+                <w:bCs/>
+              </w:rPr>
+            </w:pPr>
+            <w:r>
+              <w:rPr>
+                <w:b/>
+                <w:bCs/>
+              </w:rPr>
+              <w:t>Schwächen</w:t>
+            </w:r>
+          </w:p>
+        </w:tc>
+        <w:tc>
+          <w:tcPr>
+            <w:tcW w:w="0" w:type="auto"/>
+            <w:tcBorders>
+              <w:top w:val="single" w:sz="8" w:space="0" w:color="000000"/>
+              <w:left w:val="single" w:sz="8" w:space="0" w:color="000000"/>
+              <w:bottom w:val="single" w:sz="8" w:space="0" w:color="000000"/>
+              <w:right w:val="single" w:sz="8" w:space="0" w:color="000000"/>
+            </w:tcBorders>
+            <w:tcMar>
+              <w:top w:w="100" w:type="dxa"/>
+              <w:left w:w="100" w:type="dxa"/>
+              <w:bottom w:w="100" w:type="dxa"/>
+              <w:right w:w="100" w:type="dxa"/>
+            </w:tcMar>
+            <w:hideMark/>
+          </w:tcPr>
+          <w:p>
+            <w:pPr>
+              <w:rPr>
+                <w:b/>
+                <w:bCs/>
+              </w:rPr>
+            </w:pPr>
+            <w:r>
+              <w:rPr>
+                <w:b/>
+                <w:bCs/>
+              </w:rPr>
+              <w:t>Status 2026 / Einordnung</w:t>
+            </w:r>
+          </w:p>
+        </w:tc>
+      </w:tr>
+      <w:tr>
+        <w:tc>
+          <w:tcPr>
+            <w:tcW w:w="0" w:type="auto"/>
+            <w:tcBorders>
+              <w:top w:val="single" w:sz="8" w:space="0" w:color="000000"/>
+              <w:left w:val="single" w:sz="8" w:space="0" w:color="000000"/>
+              <w:bottom w:val="single" w:sz="8" w:space="0" w:color="000000"/>
+              <w:right w:val="single" w:sz="8" w:space="0" w:color="000000"/>
+            </w:tcBorders>
+            <w:tcMar>
+              <w:top w:w="100" w:type="dxa"/>
+              <w:left w:w="100" w:type="dxa"/>
+              <w:bottom w:w="100" w:type="dxa"/>
+              <w:right w:w="100" w:type="dxa"/>
+            </w:tcMar>
+            <w:hideMark/>
+          </w:tcPr>
+          <w:p>
+            <w:r>
+              <w:rPr>
+                <w:b/>
+                <w:bCs/>
+              </w:rPr>
+              <w:t>Claude Code</w:t>
+            </w:r>
+          </w:p>
+        </w:tc>
+        <w:tc>
+          <w:tcPr>
+            <w:tcW w:w="0" w:type="auto"/>
+            <w:tcBorders>
+              <w:top w:val="single" w:sz="8" w:space="0" w:color="000000"/>
+              <w:left w:val="single" w:sz="8" w:space="0" w:color="000000"/>
+              <w:bottom w:val="single" w:sz="8" w:space="0" w:color="000000"/>
+              <w:right w:val="single" w:sz="8" w:space="0" w:color="000000"/>
+            </w:tcBorders>
+            <w:tcMar>
+              <w:top w:w="100" w:type="dxa"/>
+              <w:left w:w="100" w:type="dxa"/>
+              <w:bottom w:w="100" w:type="dxa"/>
+              <w:right w:w="100" w:type="dxa"/>
+            </w:tcMar>
+            <w:hideMark/>
+          </w:tcPr>
+          <w:p>
+            <w:r>
+              <w:t>CLI-Agent (Proprietär)</w:t>
+            </w:r>
+          </w:p>
+        </w:tc>
+        <w:tc>
+          <w:tcPr>
+            <w:tcW w:w="0" w:type="auto"/>
+            <w:tcBorders>
+              <w:top w:val="single" w:sz="8" w:space="0" w:color="000000"/>
+              <w:left w:val="single" w:sz="8" w:space="0" w:color="000000"/>
+              <w:bottom w:val="single" w:sz="8" w:space="0" w:color="000000"/>
+              <w:right w:val="single" w:sz="8" w:space="0" w:color="000000"/>
+            </w:tcBorders>
+            <w:tcMar>
+              <w:top w:w="100" w:type="dxa"/>
+              <w:left w:w="100" w:type="dxa"/>
+              <w:bottom w:w="100" w:type="dxa"/>
+              <w:right w:w="100" w:type="dxa"/>
+            </w:tcMar>
+            <w:hideMark/>
+          </w:tcPr>
+          <w:p>
+            <w:r>
+              <w:t xml:space="preserve">Extrem schnell; perfekte Terminal-Integration; hervorragendes Code-Verständnis durch </w:t>
+            </w:r>
+            <w:r>
+              <w:rPr>
+                <w:i/>
+                <w:iCs/>
+              </w:rPr>
+              <w:t>Sonnet/Opus</w:t>
+            </w:r>
+            <w:r>
+              <w:t>.</w:t>
+            </w:r>
+          </w:p>
+        </w:tc>
+        <w:tc>
+          <w:tcPr>
+            <w:tcW w:w="0" w:type="auto"/>
+            <w:tcBorders>
+              <w:top w:val="single" w:sz="8" w:space="0" w:color="000000"/>
+              <w:left w:val="single" w:sz="8" w:space="0" w:color="000000"/>
+              <w:bottom w:val="single" w:sz="8" w:space="0" w:color="000000"/>
+              <w:right w:val="single" w:sz="8" w:space="0" w:color="000000"/>
+            </w:tcBorders>
+            <w:tcMar>
+              <w:top w:w="100" w:type="dxa"/>
+              <w:left w:w="100" w:type="dxa"/>
+              <w:bottom w:w="100" w:type="dxa"/>
+              <w:right w:w="100" w:type="dxa"/>
+            </w:tcMar>
+            <w:hideMark/>
+          </w:tcPr>
+          <w:p>
+            <w:r>
+              <w:t xml:space="preserve">Proprietär; teure API-Kosten bei großen </w:t>
+            </w:r>
+            <w:proofErr w:type="spellStart"/>
+            <w:r>
+              <w:t>Repositories</w:t>
+            </w:r>
+            <w:proofErr w:type="spellEnd"/>
+            <w:r>
+              <w:t xml:space="preserve"> ohne Flatrate-Abo.</w:t>
+            </w:r>
+          </w:p>
+        </w:tc>
+        <w:tc>
+          <w:tcPr>
+            <w:tcW w:w="0" w:type="auto"/>
+            <w:tcBorders>
+              <w:top w:val="single" w:sz="8" w:space="0" w:color="000000"/>
+              <w:left w:val="single" w:sz="8" w:space="0" w:color="000000"/>
+              <w:bottom w:val="single" w:sz="8" w:space="0" w:color="000000"/>
+              <w:right w:val="single" w:sz="8" w:space="0" w:color="000000"/>
+            </w:tcBorders>
+            <w:tcMar>
+              <w:top w:w="100" w:type="dxa"/>
+              <w:left w:w="100" w:type="dxa"/>
+              <w:bottom w:w="100" w:type="dxa"/>
+              <w:right w:w="100" w:type="dxa"/>
+            </w:tcMar>
+            <w:hideMark/>
+          </w:tcPr>
+          <w:p>
+            <w:r>
+              <w:rPr>
+                <w:b/>
+                <w:bCs/>
+              </w:rPr>
+              <w:t>Aktueller Marktführer</w:t>
+            </w:r>
+            <w:r>
+              <w:t xml:space="preserve"> für alltägliches CLI-Coding im Terminal.</w:t>
+            </w:r>
+          </w:p>
+        </w:tc>
+      </w:tr>
+      <w:tr>
+        <w:tc>
+          <w:tcPr>
+            <w:tcW w:w="0" w:type="auto"/>
+            <w:tcBorders>
+              <w:top w:val="single" w:sz="8" w:space="0" w:color="000000"/>
+              <w:left w:val="single" w:sz="8" w:space="0" w:color="000000"/>
+              <w:bottom w:val="single" w:sz="8" w:space="0" w:color="000000"/>
+              <w:right w:val="single" w:sz="8" w:space="0" w:color="000000"/>
+            </w:tcBorders>
+            <w:tcMar>
+              <w:top w:w="100" w:type="dxa"/>
+              <w:left w:w="100" w:type="dxa"/>
+              <w:bottom w:w="100" w:type="dxa"/>
+              <w:right w:w="100" w:type="dxa"/>
+            </w:tcMar>
+            <w:hideMark/>
+          </w:tcPr>
+          <w:p>
+            <w:proofErr w:type="spellStart"/>
+            <w:r>
+              <w:rPr>
+                <w:b/>
+                <w:bCs/>
+              </w:rPr>
+              <w:t>OpenHands</w:t>
+            </w:r>
+            <w:proofErr w:type="spellEnd"/>
+            <w:r>
+              <w:t xml:space="preserve"> </w:t>
+            </w:r>
+            <w:r>
+              <w:rPr>
+                <w:i/>
+                <w:iCs/>
+              </w:rPr>
+              <w:t xml:space="preserve">(ehem. </w:t>
+            </w:r>
+            <w:proofErr w:type="spellStart"/>
+            <w:r>
+              <w:rPr>
+                <w:i/>
+                <w:iCs/>
+              </w:rPr>
+              <w:t>OpenDevin</w:t>
+            </w:r>
+            <w:proofErr w:type="spellEnd"/>
+            <w:r>
+              <w:rPr>
+                <w:i/>
+                <w:iCs/>
+              </w:rPr>
+              <w:t>)</w:t>
+            </w:r>
+          </w:p>
+        </w:tc>
+        <w:tc>
+          <w:tcPr>
+            <w:tcW w:w="0" w:type="auto"/>
+            <w:tcBorders>
+              <w:top w:val="single" w:sz="8" w:space="0" w:color="000000"/>
+              <w:left w:val="single" w:sz="8" w:space="0" w:color="000000"/>
+              <w:bottom w:val="single" w:sz="8" w:space="0" w:color="000000"/>
+              <w:right w:val="single" w:sz="8" w:space="0" w:color="000000"/>
+            </w:tcBorders>
+            <w:tcMar>
+              <w:top w:w="100" w:type="dxa"/>
+              <w:left w:w="100" w:type="dxa"/>
+              <w:bottom w:w="100" w:type="dxa"/>
+              <w:right w:w="100" w:type="dxa"/>
+            </w:tcMar>
+            <w:hideMark/>
+          </w:tcPr>
+          <w:p>
+            <w:r>
+              <w:t>Open-Source Agenten-Plattform</w:t>
+            </w:r>
+          </w:p>
+        </w:tc>
+        <w:tc>
+          <w:tcPr>
+            <w:tcW w:w="0" w:type="auto"/>
+            <w:tcBorders>
+              <w:top w:val="single" w:sz="8" w:space="0" w:color="000000"/>
+              <w:left w:val="single" w:sz="8" w:space="0" w:color="000000"/>
+              <w:bottom w:val="single" w:sz="8" w:space="0" w:color="000000"/>
+              <w:right w:val="single" w:sz="8" w:space="0" w:color="000000"/>
+            </w:tcBorders>
+            <w:tcMar>
+              <w:top w:w="100" w:type="dxa"/>
+              <w:left w:w="100" w:type="dxa"/>
+              <w:bottom w:w="100" w:type="dxa"/>
+              <w:right w:w="100" w:type="dxa"/>
+            </w:tcMar>
+            <w:hideMark/>
+          </w:tcPr>
+          <w:p>
+            <w:r>
+              <w:t>Modell-agnostisch (läuft mit Claude, Gemini, lokal); sichere Docker-Sandbox; starke UI &amp; CLI.</w:t>
+            </w:r>
+          </w:p>
+        </w:tc>
+        <w:tc>
+          <w:tcPr>
+            <w:tcW w:w="0" w:type="auto"/>
+            <w:tcBorders>
+              <w:top w:val="single" w:sz="8" w:space="0" w:color="000000"/>
+              <w:left w:val="single" w:sz="8" w:space="0" w:color="000000"/>
+              <w:bottom w:val="single" w:sz="8" w:space="0" w:color="000000"/>
+              <w:right w:val="single" w:sz="8" w:space="0" w:color="000000"/>
+            </w:tcBorders>
+            <w:tcMar>
+              <w:top w:w="100" w:type="dxa"/>
+              <w:left w:w="100" w:type="dxa"/>
+              <w:bottom w:w="100" w:type="dxa"/>
+              <w:right w:w="100" w:type="dxa"/>
+            </w:tcMar>
+            <w:hideMark/>
+          </w:tcPr>
+          <w:p>
+            <w:r>
+              <w:t>Höhere Setup-Komplexität; Docker-Infrastruktur verbraucht lokal Ressourcen.</w:t>
+            </w:r>
+          </w:p>
+        </w:tc>
+        <w:tc>
+          <w:tcPr>
+            <w:tcW w:w="0" w:type="auto"/>
+            <w:tcBorders>
+              <w:top w:val="single" w:sz="8" w:space="0" w:color="000000"/>
+              <w:left w:val="single" w:sz="8" w:space="0" w:color="000000"/>
+              <w:bottom w:val="single" w:sz="8" w:space="0" w:color="000000"/>
+              <w:right w:val="single" w:sz="8" w:space="0" w:color="000000"/>
+            </w:tcBorders>
+            <w:tcMar>
+              <w:top w:w="100" w:type="dxa"/>
+              <w:left w:w="100" w:type="dxa"/>
+              <w:bottom w:w="100" w:type="dxa"/>
+              <w:right w:w="100" w:type="dxa"/>
+            </w:tcMar>
+            <w:hideMark/>
+          </w:tcPr>
+          <w:p>
+            <w:r>
+              <w:rPr>
+                <w:b/>
+                <w:bCs/>
+              </w:rPr>
+              <w:t>Beste Open-Source-Alternative</w:t>
+            </w:r>
+            <w:r>
+              <w:t xml:space="preserve"> zu Devin und Claude Code für komplexe Workflows.</w:t>
+            </w:r>
+          </w:p>
+        </w:tc>
+      </w:tr>
+      <w:tr>
+        <w:tc>
+          <w:tcPr>
+            <w:tcW w:w="0" w:type="auto"/>
+            <w:tcBorders>
+              <w:top w:val="single" w:sz="8" w:space="0" w:color="000000"/>
+              <w:left w:val="single" w:sz="8" w:space="0" w:color="000000"/>
+              <w:bottom w:val="single" w:sz="8" w:space="0" w:color="000000"/>
+              <w:right w:val="single" w:sz="8" w:space="0" w:color="000000"/>
+            </w:tcBorders>
+            <w:tcMar>
+              <w:top w:w="100" w:type="dxa"/>
+              <w:left w:w="100" w:type="dxa"/>
+              <w:bottom w:w="100" w:type="dxa"/>
+              <w:right w:w="100" w:type="dxa"/>
+            </w:tcMar>
+            <w:hideMark/>
+          </w:tcPr>
+          <w:p>
+            <w:r>
+              <w:rPr>
+                <w:b/>
+                <w:bCs/>
+              </w:rPr>
+              <w:t>GLM 5.2</w:t>
+            </w:r>
+          </w:p>
+        </w:tc>
+        <w:tc>
+          <w:tcPr>
+            <w:tcW w:w="0" w:type="auto"/>
+            <w:tcBorders>
+              <w:top w:val="single" w:sz="8" w:space="0" w:color="000000"/>
+              <w:left w:val="single" w:sz="8" w:space="0" w:color="000000"/>
+              <w:bottom w:val="single" w:sz="8" w:space="0" w:color="000000"/>
+              <w:right w:val="single" w:sz="8" w:space="0" w:color="000000"/>
+            </w:tcBorders>
+            <w:tcMar>
+              <w:top w:w="100" w:type="dxa"/>
+              <w:left w:w="100" w:type="dxa"/>
+              <w:bottom w:w="100" w:type="dxa"/>
+              <w:right w:w="100" w:type="dxa"/>
+            </w:tcMar>
+            <w:hideMark/>
+          </w:tcPr>
+          <w:p>
+            <w:r>
+              <w:t>Open-</w:t>
+            </w:r>
+            <w:proofErr w:type="spellStart"/>
+            <w:r>
+              <w:t>Weight</w:t>
+            </w:r>
+            <w:proofErr w:type="spellEnd"/>
+            <w:r>
+              <w:t xml:space="preserve"> LLM (Modell)</w:t>
+            </w:r>
+          </w:p>
+        </w:tc>
+        <w:tc>
+          <w:tcPr>
+            <w:tcW w:w="0" w:type="auto"/>
+            <w:tcBorders>
+              <w:top w:val="single" w:sz="8" w:space="0" w:color="000000"/>
+              <w:left w:val="single" w:sz="8" w:space="0" w:color="000000"/>
+              <w:bottom w:val="single" w:sz="8" w:space="0" w:color="000000"/>
+              <w:right w:val="single" w:sz="8" w:space="0" w:color="000000"/>
+            </w:tcBorders>
+            <w:tcMar>
+              <w:top w:w="100" w:type="dxa"/>
+              <w:left w:w="100" w:type="dxa"/>
+              <w:bottom w:w="100" w:type="dxa"/>
+              <w:right w:w="100" w:type="dxa"/>
+            </w:tcMar>
+            <w:hideMark/>
+          </w:tcPr>
+          <w:p>
+            <w:r>
+              <w:t xml:space="preserve">Gigantischer 1M-Token-Kontext; MIT-Lizenz; extrem stark bei Agenten-Logik und </w:t>
+            </w:r>
+            <w:proofErr w:type="spellStart"/>
+            <w:r>
+              <w:t>Full</w:t>
+            </w:r>
+            <w:proofErr w:type="spellEnd"/>
+            <w:r>
+              <w:t>-Stack HTML/JS-Design.</w:t>
+            </w:r>
+          </w:p>
+        </w:tc>
+        <w:tc>
+          <w:tcPr>
+            <w:tcW w:w="0" w:type="auto"/>
+            <w:tcBorders>
+              <w:top w:val="single" w:sz="8" w:space="0" w:color="000000"/>
+              <w:left w:val="single" w:sz="8" w:space="0" w:color="000000"/>
+              <w:bottom w:val="single" w:sz="8" w:space="0" w:color="000000"/>
+              <w:right w:val="single" w:sz="8" w:space="0" w:color="000000"/>
+            </w:tcBorders>
+            <w:tcMar>
+              <w:top w:w="100" w:type="dxa"/>
+              <w:left w:w="100" w:type="dxa"/>
+              <w:bottom w:w="100" w:type="dxa"/>
+              <w:right w:w="100" w:type="dxa"/>
+            </w:tcMar>
+            <w:hideMark/>
+          </w:tcPr>
+          <w:p>
+            <w:r>
+              <w:t>Kein fertiges Tool wie Claude Code, sondern ein Modell, das Infrastruktur benötigt.</w:t>
+            </w:r>
+          </w:p>
+        </w:tc>
+        <w:tc>
+          <w:tcPr>
+            <w:tcW w:w="0" w:type="auto"/>
+            <w:tcBorders>
+              <w:top w:val="single" w:sz="8" w:space="0" w:color="000000"/>
+              <w:left w:val="single" w:sz="8" w:space="0" w:color="000000"/>
+              <w:bottom w:val="single" w:sz="8" w:space="0" w:color="000000"/>
+              <w:right w:val="single" w:sz="8" w:space="0" w:color="000000"/>
+            </w:tcBorders>
+            <w:tcMar>
+              <w:top w:w="100" w:type="dxa"/>
+              <w:left w:w="100" w:type="dxa"/>
+              <w:bottom w:w="100" w:type="dxa"/>
+              <w:right w:w="100" w:type="dxa"/>
+            </w:tcMar>
+            <w:hideMark/>
+          </w:tcPr>
+          <w:p>
+            <w:r>
+              <w:rPr>
+                <w:b/>
+                <w:bCs/>
+              </w:rPr>
+              <w:t>Bestes Open-Source-Modell</w:t>
+            </w:r>
+            <w:r>
+              <w:t xml:space="preserve"> für Code-Agenten, schlägt kommerzielle Modelle in Preis-Leistung.</w:t>
+            </w:r>
+          </w:p>
+        </w:tc>
+      </w:tr>
+      <w:tr>
+        <w:tc>
+          <w:tcPr>
+            <w:tcW w:w="0" w:type="auto"/>
+            <w:tcBorders>
+              <w:top w:val="single" w:sz="8" w:space="0" w:color="000000"/>
+              <w:left w:val="single" w:sz="8" w:space="0" w:color="000000"/>
+              <w:bottom w:val="single" w:sz="8" w:space="0" w:color="000000"/>
+              <w:right w:val="single" w:sz="8" w:space="0" w:color="000000"/>
+            </w:tcBorders>
+            <w:tcMar>
+              <w:top w:w="100" w:type="dxa"/>
+              <w:left w:w="100" w:type="dxa"/>
+              <w:bottom w:w="100" w:type="dxa"/>
+              <w:right w:w="100" w:type="dxa"/>
+            </w:tcMar>
+            <w:hideMark/>
+          </w:tcPr>
+          <w:p>
+            <w:proofErr w:type="spellStart"/>
+            <w:r>
+              <w:rPr>
+                <w:b/>
+                <w:bCs/>
+              </w:rPr>
+              <w:t>LangGraph</w:t>
+            </w:r>
+            <w:proofErr w:type="spellEnd"/>
+          </w:p>
+        </w:tc>
+        <w:tc>
+          <w:tcPr>
+            <w:tcW w:w="0" w:type="auto"/>
+            <w:tcBorders>
+              <w:top w:val="single" w:sz="8" w:space="0" w:color="000000"/>
+              <w:left w:val="single" w:sz="8" w:space="0" w:color="000000"/>
+              <w:bottom w:val="single" w:sz="8" w:space="0" w:color="000000"/>
+              <w:right w:val="single" w:sz="8" w:space="0" w:color="000000"/>
+            </w:tcBorders>
+            <w:tcMar>
+              <w:top w:w="100" w:type="dxa"/>
+              <w:left w:w="100" w:type="dxa"/>
+              <w:bottom w:w="100" w:type="dxa"/>
+              <w:right w:w="100" w:type="dxa"/>
+            </w:tcMar>
+            <w:hideMark/>
+          </w:tcPr>
+          <w:p>
+            <w:r>
+              <w:t>Entwickler-Framework</w:t>
+            </w:r>
+          </w:p>
+        </w:tc>
+        <w:tc>
+          <w:tcPr>
+            <w:tcW w:w="0" w:type="auto"/>
+            <w:tcBorders>
+              <w:top w:val="single" w:sz="8" w:space="0" w:color="000000"/>
+              <w:left w:val="single" w:sz="8" w:space="0" w:color="000000"/>
+              <w:bottom w:val="single" w:sz="8" w:space="0" w:color="000000"/>
+              <w:right w:val="single" w:sz="8" w:space="0" w:color="000000"/>
+            </w:tcBorders>
+            <w:tcMar>
+              <w:top w:w="100" w:type="dxa"/>
+              <w:left w:w="100" w:type="dxa"/>
+              <w:bottom w:w="100" w:type="dxa"/>
+              <w:right w:w="100" w:type="dxa"/>
+            </w:tcMar>
+            <w:hideMark/>
+          </w:tcPr>
+          <w:p>
+            <w:r>
+              <w:t>Maximale Kontrolle; perfekt für maßgeschneiderte Firmen-Code-Agenten und Multi-Agenten-Systeme.</w:t>
+            </w:r>
+          </w:p>
+        </w:tc>
+        <w:tc>
+          <w:tcPr>
+            <w:tcW w:w="0" w:type="auto"/>
+            <w:tcBorders>
+              <w:top w:val="single" w:sz="8" w:space="0" w:color="000000"/>
+              <w:left w:val="single" w:sz="8" w:space="0" w:color="000000"/>
+              <w:bottom w:val="single" w:sz="8" w:space="0" w:color="000000"/>
+              <w:right w:val="single" w:sz="8" w:space="0" w:color="000000"/>
+            </w:tcBorders>
+            <w:tcMar>
+              <w:top w:w="100" w:type="dxa"/>
+              <w:left w:w="100" w:type="dxa"/>
+              <w:bottom w:w="100" w:type="dxa"/>
+              <w:right w:w="100" w:type="dxa"/>
+            </w:tcMar>
+            <w:hideMark/>
+          </w:tcPr>
+          <w:p>
+            <w:r>
+              <w:t>Keine Out-</w:t>
+            </w:r>
+            <w:proofErr w:type="spellStart"/>
+            <w:r>
+              <w:t>of</w:t>
+            </w:r>
+            <w:proofErr w:type="spellEnd"/>
+            <w:r>
+              <w:t>-</w:t>
+            </w:r>
+            <w:proofErr w:type="spellStart"/>
+            <w:r>
+              <w:t>the</w:t>
+            </w:r>
+            <w:proofErr w:type="spellEnd"/>
+            <w:r>
+              <w:t>-box-App; man muss den Coding-Agenten komplett selbst programmieren.</w:t>
+            </w:r>
+          </w:p>
+        </w:tc>
+        <w:tc>
+          <w:tcPr>
+            <w:tcW w:w="0" w:type="auto"/>
+            <w:tcBorders>
+              <w:top w:val="single" w:sz="8" w:space="0" w:color="000000"/>
+              <w:left w:val="single" w:sz="8" w:space="0" w:color="000000"/>
+              <w:bottom w:val="single" w:sz="8" w:space="0" w:color="000000"/>
+              <w:right w:val="single" w:sz="8" w:space="0" w:color="000000"/>
+            </w:tcBorders>
+            <w:tcMar>
+              <w:top w:w="100" w:type="dxa"/>
+              <w:left w:w="100" w:type="dxa"/>
+              <w:bottom w:w="100" w:type="dxa"/>
+              <w:right w:w="100" w:type="dxa"/>
+            </w:tcMar>
+            <w:hideMark/>
+          </w:tcPr>
+          <w:p>
+            <w:r>
+              <w:rPr>
+                <w:b/>
+                <w:bCs/>
+              </w:rPr>
+              <w:t>Industrie-Standard Framework</w:t>
+            </w:r>
+            <w:r>
+              <w:t xml:space="preserve"> für Entwickler, die eigene Agenten-Pipelines bauen.</w:t>
+            </w:r>
+          </w:p>
+        </w:tc>
+      </w:tr>
+      <w:tr>
+        <w:tc>
+          <w:tcPr>
+            <w:tcW w:w="0" w:type="auto"/>
+            <w:tcBorders>
+              <w:top w:val="single" w:sz="8" w:space="0" w:color="000000"/>
+              <w:left w:val="single" w:sz="8" w:space="0" w:color="000000"/>
+              <w:bottom w:val="single" w:sz="8" w:space="0" w:color="000000"/>
+              <w:right w:val="single" w:sz="8" w:space="0" w:color="000000"/>
+            </w:tcBorders>
+            <w:tcMar>
+              <w:top w:w="100" w:type="dxa"/>
+              <w:left w:w="100" w:type="dxa"/>
+              <w:bottom w:w="100" w:type="dxa"/>
+              <w:right w:w="100" w:type="dxa"/>
+            </w:tcMar>
+            <w:hideMark/>
+          </w:tcPr>
+          <w:p>
+            <w:r>
+              <w:rPr>
+                <w:b/>
+                <w:bCs/>
+              </w:rPr>
+              <w:lastRenderedPageBreak/>
+              <w:t>OpenAI Codex</w:t>
+            </w:r>
+          </w:p>
+        </w:tc>
+        <w:tc>
+          <w:tcPr>
+            <w:tcW w:w="0" w:type="auto"/>
+            <w:tcBorders>
+              <w:top w:val="single" w:sz="8" w:space="0" w:color="000000"/>
+              <w:left w:val="single" w:sz="8" w:space="0" w:color="000000"/>
+              <w:bottom w:val="single" w:sz="8" w:space="0" w:color="000000"/>
+              <w:right w:val="single" w:sz="8" w:space="0" w:color="000000"/>
+            </w:tcBorders>
+            <w:tcMar>
+              <w:top w:w="100" w:type="dxa"/>
+              <w:left w:w="100" w:type="dxa"/>
+              <w:bottom w:w="100" w:type="dxa"/>
+              <w:right w:w="100" w:type="dxa"/>
+            </w:tcMar>
+            <w:hideMark/>
+          </w:tcPr>
+          <w:p>
+            <w:r>
+              <w:t>LLM (Modell)</w:t>
+            </w:r>
+          </w:p>
+        </w:tc>
+        <w:tc>
+          <w:tcPr>
+            <w:tcW w:w="0" w:type="auto"/>
+            <w:tcBorders>
+              <w:top w:val="single" w:sz="8" w:space="0" w:color="000000"/>
+              <w:left w:val="single" w:sz="8" w:space="0" w:color="000000"/>
+              <w:bottom w:val="single" w:sz="8" w:space="0" w:color="000000"/>
+              <w:right w:val="single" w:sz="8" w:space="0" w:color="000000"/>
+            </w:tcBorders>
+            <w:tcMar>
+              <w:top w:w="100" w:type="dxa"/>
+              <w:left w:w="100" w:type="dxa"/>
+              <w:bottom w:w="100" w:type="dxa"/>
+              <w:right w:w="100" w:type="dxa"/>
+            </w:tcMar>
+            <w:hideMark/>
+          </w:tcPr>
+          <w:p>
+            <w:r>
+              <w:t>Historischer Pionier (Basis des alten GitHub Copilot).</w:t>
+            </w:r>
+          </w:p>
+        </w:tc>
+        <w:tc>
+          <w:tcPr>
+            <w:tcW w:w="0" w:type="auto"/>
+            <w:tcBorders>
+              <w:top w:val="single" w:sz="8" w:space="0" w:color="000000"/>
+              <w:left w:val="single" w:sz="8" w:space="0" w:color="000000"/>
+              <w:bottom w:val="single" w:sz="8" w:space="0" w:color="000000"/>
+              <w:right w:val="single" w:sz="8" w:space="0" w:color="000000"/>
+            </w:tcBorders>
+            <w:tcMar>
+              <w:top w:w="100" w:type="dxa"/>
+              <w:left w:w="100" w:type="dxa"/>
+              <w:bottom w:w="100" w:type="dxa"/>
+              <w:right w:w="100" w:type="dxa"/>
+            </w:tcMar>
+            <w:hideMark/>
+          </w:tcPr>
+          <w:p>
+            <w:r>
+              <w:t>Technisch komplett veraltet; von GPT-4o und o-Modellen abgelöst.</w:t>
+            </w:r>
+          </w:p>
+        </w:tc>
+        <w:tc>
+          <w:tcPr>
+            <w:tcW w:w="0" w:type="auto"/>
+            <w:tcBorders>
+              <w:top w:val="single" w:sz="8" w:space="0" w:color="000000"/>
+              <w:left w:val="single" w:sz="8" w:space="0" w:color="000000"/>
+              <w:bottom w:val="single" w:sz="8" w:space="0" w:color="000000"/>
+              <w:right w:val="single" w:sz="8" w:space="0" w:color="000000"/>
+            </w:tcBorders>
+            <w:tcMar>
+              <w:top w:w="100" w:type="dxa"/>
+              <w:left w:w="100" w:type="dxa"/>
+              <w:bottom w:w="100" w:type="dxa"/>
+              <w:right w:w="100" w:type="dxa"/>
+            </w:tcMar>
+            <w:hideMark/>
+          </w:tcPr>
+          <w:p>
+            <w:r>
+              <w:rPr>
+                <w:b/>
+                <w:bCs/>
+              </w:rPr>
+              <w:t>Veraltet (Legacy).</w:t>
+            </w:r>
+            <w:r>
+              <w:t xml:space="preserve"> Spielt heute keine Rolle mehr.</w:t>
+            </w:r>
+          </w:p>
+        </w:tc>
+      </w:tr>
+      <w:tr>
+        <w:tc>
+          <w:tcPr>
+            <w:tcW w:w="0" w:type="auto"/>
+            <w:tcBorders>
+              <w:top w:val="single" w:sz="8" w:space="0" w:color="000000"/>
+              <w:left w:val="single" w:sz="8" w:space="0" w:color="000000"/>
+              <w:bottom w:val="single" w:sz="8" w:space="0" w:color="000000"/>
+              <w:right w:val="single" w:sz="8" w:space="0" w:color="000000"/>
+            </w:tcBorders>
+            <w:tcMar>
+              <w:top w:w="100" w:type="dxa"/>
+              <w:left w:w="100" w:type="dxa"/>
+              <w:bottom w:w="100" w:type="dxa"/>
+              <w:right w:w="100" w:type="dxa"/>
+            </w:tcMar>
+            <w:hideMark/>
+          </w:tcPr>
+          <w:p>
+            <w:proofErr w:type="spellStart"/>
+            <w:r>
+              <w:rPr>
+                <w:i/>
+                <w:iCs/>
+              </w:rPr>
+              <w:t>Antigrafity</w:t>
+            </w:r>
+            <w:proofErr w:type="spellEnd"/>
+          </w:p>
+        </w:tc>
+        <w:tc>
+          <w:tcPr>
+            <w:tcW w:w="0" w:type="auto"/>
+            <w:tcBorders>
+              <w:top w:val="single" w:sz="8" w:space="0" w:color="000000"/>
+              <w:left w:val="single" w:sz="8" w:space="0" w:color="000000"/>
+              <w:bottom w:val="single" w:sz="8" w:space="0" w:color="000000"/>
+              <w:right w:val="single" w:sz="8" w:space="0" w:color="000000"/>
+            </w:tcBorders>
+            <w:tcMar>
+              <w:top w:w="100" w:type="dxa"/>
+              <w:left w:w="100" w:type="dxa"/>
+              <w:bottom w:w="100" w:type="dxa"/>
+              <w:right w:w="100" w:type="dxa"/>
+            </w:tcMar>
+            <w:hideMark/>
+          </w:tcPr>
+          <w:p>
+            <w:r>
+              <w:t>Unbekannt / Tippfehler</w:t>
+            </w:r>
+          </w:p>
+        </w:tc>
+        <w:tc>
+          <w:tcPr>
+            <w:tcW w:w="0" w:type="auto"/>
+            <w:tcBorders>
+              <w:top w:val="single" w:sz="8" w:space="0" w:color="000000"/>
+              <w:left w:val="single" w:sz="8" w:space="0" w:color="000000"/>
+              <w:bottom w:val="single" w:sz="8" w:space="0" w:color="000000"/>
+              <w:right w:val="single" w:sz="8" w:space="0" w:color="000000"/>
+            </w:tcBorders>
+            <w:tcMar>
+              <w:top w:w="100" w:type="dxa"/>
+              <w:left w:w="100" w:type="dxa"/>
+              <w:bottom w:w="100" w:type="dxa"/>
+              <w:right w:w="100" w:type="dxa"/>
+            </w:tcMar>
+            <w:hideMark/>
+          </w:tcPr>
+          <w:p>
+            <w:r>
+              <w:t xml:space="preserve">Vermutlich ist ein Framework wie </w:t>
+            </w:r>
+            <w:proofErr w:type="spellStart"/>
+            <w:r>
+              <w:rPr>
+                <w:b/>
+                <w:bCs/>
+              </w:rPr>
+              <w:t>AutoGPT</w:t>
+            </w:r>
+            <w:proofErr w:type="spellEnd"/>
+            <w:r>
+              <w:t xml:space="preserve">, </w:t>
+            </w:r>
+            <w:proofErr w:type="spellStart"/>
+            <w:r>
+              <w:rPr>
+                <w:b/>
+                <w:bCs/>
+              </w:rPr>
+              <w:t>Aider</w:t>
+            </w:r>
+            <w:proofErr w:type="spellEnd"/>
+            <w:r>
+              <w:t xml:space="preserve"> oder das mathematische Python-Paket </w:t>
+            </w:r>
+            <w:proofErr w:type="spellStart"/>
+            <w:r>
+              <w:rPr>
+                <w:i/>
+                <w:iCs/>
+              </w:rPr>
+              <w:t>Antigravity</w:t>
+            </w:r>
+            <w:proofErr w:type="spellEnd"/>
+            <w:r>
+              <w:t xml:space="preserve"> gemeint.</w:t>
+            </w:r>
+          </w:p>
+        </w:tc>
+        <w:tc>
+          <w:tcPr>
+            <w:tcW w:w="0" w:type="auto"/>
+            <w:tcBorders>
+              <w:top w:val="single" w:sz="8" w:space="0" w:color="000000"/>
+              <w:left w:val="single" w:sz="8" w:space="0" w:color="000000"/>
+              <w:bottom w:val="single" w:sz="8" w:space="0" w:color="000000"/>
+              <w:right w:val="single" w:sz="8" w:space="0" w:color="000000"/>
+            </w:tcBorders>
+            <w:tcMar>
+              <w:top w:w="100" w:type="dxa"/>
+              <w:left w:w="100" w:type="dxa"/>
+              <w:bottom w:w="100" w:type="dxa"/>
+              <w:right w:w="100" w:type="dxa"/>
+            </w:tcMar>
+            <w:hideMark/>
+          </w:tcPr>
+          <w:p>
+            <w:r>
+              <w:t>–</w:t>
+            </w:r>
+          </w:p>
+        </w:tc>
+        <w:tc>
+          <w:tcPr>
+            <w:tcW w:w="0" w:type="auto"/>
+            <w:tcBorders>
+              <w:top w:val="single" w:sz="8" w:space="0" w:color="000000"/>
+              <w:left w:val="single" w:sz="8" w:space="0" w:color="000000"/>
+              <w:bottom w:val="single" w:sz="8" w:space="0" w:color="000000"/>
+              <w:right w:val="single" w:sz="8" w:space="0" w:color="000000"/>
+            </w:tcBorders>
+            <w:tcMar>
+              <w:top w:w="100" w:type="dxa"/>
+              <w:left w:w="100" w:type="dxa"/>
+              <w:bottom w:w="100" w:type="dxa"/>
+              <w:right w:w="100" w:type="dxa"/>
+            </w:tcMar>
+            <w:hideMark/>
+          </w:tcPr>
+          <w:p>
+            <w:r>
+              <w:t xml:space="preserve">Falls </w:t>
+            </w:r>
+            <w:proofErr w:type="spellStart"/>
+            <w:r>
+              <w:rPr>
+                <w:b/>
+                <w:bCs/>
+              </w:rPr>
+              <w:t>Aider</w:t>
+            </w:r>
+            <w:proofErr w:type="spellEnd"/>
+            <w:r>
+              <w:t xml:space="preserve"> gemeint ist: Hervorragender, leichtgewichtiger CLI-Coder.</w:t>
+            </w:r>
+          </w:p>
+        </w:tc>
+      </w:tr>
+    </w:tbl>
+    <w:p>
+      <w:r>
+        <w:pict w14:anchorId="4F4D197B">
+          <v:rect id="_x0000_i1046" style="width:0;height:.75pt" o:hralign="center" o:hrstd="t" o:hr="t" fillcolor="#a0a0a0" stroked="f"/>
+        </w:pict>
+      </w:r>
+    </w:p>
+    <w:p>
+      <w:pPr>
+        <w:rPr>
+          <w:b/>
+          <w:bCs/>
+        </w:rPr>
+      </w:pPr>
+      <w:r>
+        <w:rPr>
+          <w:b/>
+          <w:bCs/>
+        </w:rPr>
+        <w:t>Detaillierte Analyse der Top-Kandidaten</w:t>
+      </w:r>
+    </w:p>
+    <w:p>
+      <w:pPr>
+        <w:rPr>
+          <w:b/>
+          <w:bCs/>
+        </w:rPr>
+      </w:pPr>
+      <w:r>
+        <w:rPr>
+          <w:b/>
+          <w:bCs/>
+        </w:rPr>
+        <w:t>1. Claude Code: Der Terminal-König</w:t>
+      </w:r>
+    </w:p>
+    <w:p>
+      <w:r>
+        <w:t xml:space="preserve">Claude Code glänzt durch seine </w:t>
+      </w:r>
+      <w:r>
+        <w:rPr>
+          <w:b/>
+          <w:bCs/>
+        </w:rPr>
+        <w:t>nahtlose Integration</w:t>
+      </w:r>
+      <w:r>
+        <w:t xml:space="preserve"> in Ihre tägliche Arbeit. Sie starten es direkt im </w:t>
+      </w:r>
+      <w:proofErr w:type="spellStart"/>
+      <w:r>
+        <w:t>Git</w:t>
+      </w:r>
+      <w:proofErr w:type="spellEnd"/>
+      <w:r>
+        <w:t xml:space="preserve">-Repository. Es versteht komplexe Architekturen, schlägt </w:t>
+      </w:r>
+      <w:proofErr w:type="spellStart"/>
+      <w:r>
+        <w:t>Git-Commits</w:t>
+      </w:r>
+      <w:proofErr w:type="spellEnd"/>
+      <w:r>
+        <w:t xml:space="preserve"> vor, fixt Bugs und führt Tests autonom aus. Durch </w:t>
+      </w:r>
+      <w:r>
+        <w:rPr>
+          <w:i/>
+          <w:iCs/>
+        </w:rPr>
+        <w:t>Prompt Caching</w:t>
+      </w:r>
+      <w:r>
+        <w:t xml:space="preserve"> sind die Kosten im Vergleich zu älteren API-Strukturen gesunken, bei riesigen Codebasen bleibt es via API jedoch ein Kostenfaktor. [2, 7, 9, 11, 17] </w:t>
+      </w:r>
+    </w:p>
+    <w:p>
+      <w:pPr>
+        <w:rPr>
+          <w:b/>
+          <w:bCs/>
+        </w:rPr>
+      </w:pPr>
+      <w:r>
+        <w:rPr>
+          <w:b/>
+          <w:bCs/>
+        </w:rPr>
+        <w:t xml:space="preserve">2. </w:t>
+      </w:r>
+      <w:proofErr w:type="spellStart"/>
+      <w:r>
+        <w:rPr>
+          <w:b/>
+          <w:bCs/>
+        </w:rPr>
+        <w:t>OpenHands</w:t>
+      </w:r>
+      <w:proofErr w:type="spellEnd"/>
+      <w:r>
+        <w:rPr>
+          <w:b/>
+          <w:bCs/>
+        </w:rPr>
+        <w:t xml:space="preserve"> (mit </w:t>
+      </w:r>
+      <w:proofErr w:type="spellStart"/>
+      <w:r>
+        <w:rPr>
+          <w:b/>
+          <w:bCs/>
+        </w:rPr>
+        <w:t>CodeAct</w:t>
+      </w:r>
+      <w:proofErr w:type="spellEnd"/>
+      <w:r>
+        <w:rPr>
+          <w:b/>
+          <w:bCs/>
+        </w:rPr>
+        <w:t xml:space="preserve"> 2.1): Das Open-Source-Kraftpaket [11] </w:t>
+      </w:r>
+    </w:p>
+    <w:p>
+      <w:hyperlink r:id="rId6" w:history="1">
+        <w:proofErr w:type="spellStart"/>
+        <w:r>
+          <w:rPr>
+            <w:rStyle w:val="Hyperlink"/>
+          </w:rPr>
+          <w:t>OpenHands</w:t>
+        </w:r>
+        <w:proofErr w:type="spellEnd"/>
+      </w:hyperlink>
+      <w:r>
+        <w:t xml:space="preserve"> ist die mächtigste freie Plattform. Dank des </w:t>
+      </w:r>
+      <w:proofErr w:type="spellStart"/>
+      <w:r>
+        <w:rPr>
+          <w:b/>
+          <w:bCs/>
+        </w:rPr>
+        <w:t>CodeAct</w:t>
+      </w:r>
+      <w:proofErr w:type="spellEnd"/>
+      <w:r>
+        <w:rPr>
+          <w:b/>
+          <w:bCs/>
+        </w:rPr>
+        <w:t xml:space="preserve"> 2.1</w:t>
+      </w:r>
+      <w:r>
+        <w:t xml:space="preserve"> Frameworks erreicht es auf dem bekannten </w:t>
+      </w:r>
+      <w:r>
+        <w:rPr>
+          <w:i/>
+          <w:iCs/>
+        </w:rPr>
+        <w:t>SWE-Bench</w:t>
+      </w:r>
+      <w:r>
+        <w:t xml:space="preserve"> (Software Engineering Benchmark) Spitzenwerte und schlägt in Kombination mit High-End-Modellen oft die Standard-Webinterfaces. Da es in einer isolierten Docker-Umgebung läuft, kann es gefahrlos Bash-Befehle ausführen und Web-Recherchen anstellen. Sie können es mit </w:t>
+      </w:r>
+      <w:r>
+        <w:rPr>
+          <w:i/>
+          <w:iCs/>
+        </w:rPr>
+        <w:t>Gemini 2.5 Pro</w:t>
+      </w:r>
+      <w:r>
+        <w:t xml:space="preserve"> oder lokalen Modellen füttern. [6, 10, 11] </w:t>
+      </w:r>
+    </w:p>
+    <w:p>
+      <w:pPr>
+        <w:rPr>
+          <w:b/>
+          <w:bCs/>
+        </w:rPr>
+      </w:pPr>
+      <w:r>
+        <w:rPr>
+          <w:b/>
+          <w:bCs/>
+        </w:rPr>
+        <w:t>3. GLM 5.2: Der Open-Source-Geheimtipp</w:t>
+      </w:r>
+    </w:p>
+    <w:p>
+      <w:r>
+        <w:t xml:space="preserve">Das von Z.AI / </w:t>
+      </w:r>
+      <w:proofErr w:type="spellStart"/>
+      <w:r>
+        <w:t>Zhipu</w:t>
+      </w:r>
+      <w:proofErr w:type="spellEnd"/>
+      <w:r>
+        <w:t xml:space="preserve"> veröffentlichte </w:t>
+      </w:r>
+      <w:hyperlink r:id="rId7" w:history="1">
+        <w:r>
+          <w:rPr>
+            <w:rStyle w:val="Hyperlink"/>
+          </w:rPr>
+          <w:t>GLM-5.2</w:t>
+        </w:r>
+      </w:hyperlink>
+      <w:r>
+        <w:t xml:space="preserve"> hat die Open-Source-Community im Sturm erobert. Mit seinem </w:t>
+      </w:r>
+      <w:r>
+        <w:rPr>
+          <w:b/>
+          <w:bCs/>
+        </w:rPr>
+        <w:t>1-Million-Token-Kontextfenster</w:t>
+      </w:r>
+      <w:r>
+        <w:t xml:space="preserve"> kann es ganze Applikationen auf einmal analysieren. In Benchmark-Tests für autonome Workflows (z.B. Erstellung von </w:t>
+      </w:r>
+      <w:proofErr w:type="spellStart"/>
+      <w:r>
+        <w:t>Frontends</w:t>
+      </w:r>
+      <w:proofErr w:type="spellEnd"/>
+      <w:r>
+        <w:t xml:space="preserve"> oder Automatisierungs-Skripten) agiert es auf dem Niveau von kommerziellen Systemen, ist aber dank MIT-Lizenz komplett kostenfrei selbst </w:t>
+      </w:r>
+      <w:proofErr w:type="spellStart"/>
+      <w:r>
+        <w:t>hostbar</w:t>
+      </w:r>
+      <w:proofErr w:type="spellEnd"/>
+      <w:r>
+        <w:t xml:space="preserve">. [12, 13, 14, 15, 18] </w:t>
+      </w:r>
+    </w:p>
+    <w:p>
+      <w:r>
+        <w:lastRenderedPageBreak/>
+        <w:pict w14:anchorId="5BD76FF4">
+          <v:rect id="_x0000_i1047" style="width:0;height:.75pt" o:hralign="center" o:hrstd="t" o:hr="t" fillcolor="#a0a0a0" stroked="f"/>
+        </w:pict>
+      </w:r>
+    </w:p>
+    <w:p>
+      <w:pPr>
+        <w:rPr>
+          <w:b/>
+          <w:bCs/>
+        </w:rPr>
+      </w:pPr>
+      <w:r>
+        <w:rPr>
+          <w:b/>
+          <w:bCs/>
+        </w:rPr>
+        <w:t>Welche Tools sind aktuell die besten? (Mitte 2026)</w:t>
+      </w:r>
+    </w:p>
+    <w:p>
+      <w:r>
+        <w:t xml:space="preserve">Welches Tool für Sie das </w:t>
+      </w:r>
+      <w:proofErr w:type="spellStart"/>
+      <w:r>
+        <w:t>beste</w:t>
+      </w:r>
+      <w:proofErr w:type="spellEnd"/>
+      <w:r>
+        <w:t xml:space="preserve"> ist, hängt primär von Ihrem Einsatzzweck ab:</w:t>
+      </w:r>
+    </w:p>
+    <w:p>
+      <w:pPr>
+        <w:numPr>
+          <w:ilvl w:val="0"/>
+          <w:numId w:val="5"/>
+        </w:numPr>
+      </w:pPr>
+      <w:r>
+        <w:rPr>
+          <w:b/>
+          <w:bCs/>
+        </w:rPr>
+        <w:t>Für die tägliche Arbeit im Terminal (Schnelligkeit &amp; Qualität):</w:t>
+      </w:r>
+      <w:r>
+        <w:br/>
+      </w:r>
+      <w:r>
+        <w:rPr>
+          <w:b/>
+          <w:bCs/>
+        </w:rPr>
+        <w:t>Claude Code</w:t>
+      </w:r>
+      <w:r>
+        <w:t xml:space="preserve"> ist unschlagbar, wenn Sie bereit sind, für die </w:t>
+      </w:r>
+      <w:proofErr w:type="spellStart"/>
+      <w:r>
+        <w:t>Anthropic</w:t>
+      </w:r>
+      <w:proofErr w:type="spellEnd"/>
+      <w:r>
+        <w:t xml:space="preserve">-Infrastruktur (Abo oder API) zu bezahlen. Alternativ ist </w:t>
+      </w:r>
+      <w:proofErr w:type="spellStart"/>
+      <w:r>
+        <w:rPr>
+          <w:b/>
+          <w:bCs/>
+        </w:rPr>
+        <w:t>Aider</w:t>
+      </w:r>
+      <w:proofErr w:type="spellEnd"/>
+      <w:r>
+        <w:t xml:space="preserve"> das beste und flexibelste CLI-Tool für Sparfüchse, da es mit jeder API (z.B. </w:t>
+      </w:r>
+      <w:proofErr w:type="spellStart"/>
+      <w:r>
+        <w:t>DeepSeek</w:t>
+      </w:r>
+      <w:proofErr w:type="spellEnd"/>
+      <w:r>
+        <w:t xml:space="preserve">, </w:t>
+      </w:r>
+      <w:proofErr w:type="spellStart"/>
+      <w:r>
+        <w:t>OpenRouter</w:t>
+      </w:r>
+      <w:proofErr w:type="spellEnd"/>
+      <w:r>
+        <w:t xml:space="preserve">) funktioniert. [2, 8] </w:t>
+      </w:r>
+    </w:p>
+    <w:p>
+      <w:pPr>
+        <w:numPr>
+          <w:ilvl w:val="0"/>
+          <w:numId w:val="5"/>
+        </w:numPr>
+      </w:pPr>
+      <w:r>
+        <w:rPr>
+          <w:b/>
+          <w:bCs/>
+        </w:rPr>
+        <w:t>Für maximale Flexibilität und Datensicherheit (Open Source):</w:t>
+      </w:r>
+      <w:r>
+        <w:br/>
+      </w:r>
+      <w:proofErr w:type="spellStart"/>
+      <w:r>
+        <w:rPr>
+          <w:b/>
+          <w:bCs/>
+        </w:rPr>
+        <w:t>OpenHands</w:t>
+      </w:r>
+      <w:proofErr w:type="spellEnd"/>
+      <w:r>
+        <w:t xml:space="preserve"> (als Plattform) kombiniert mit </w:t>
+      </w:r>
+      <w:r>
+        <w:rPr>
+          <w:b/>
+          <w:bCs/>
+        </w:rPr>
+        <w:t>GLM 5.2</w:t>
+      </w:r>
+      <w:r>
+        <w:t xml:space="preserve"> oder </w:t>
+      </w:r>
+      <w:r>
+        <w:rPr>
+          <w:i/>
+          <w:iCs/>
+        </w:rPr>
+        <w:t>Claude 3.5 Sonnet</w:t>
+      </w:r>
+      <w:r>
+        <w:t xml:space="preserve"> (als Modell). Sie erhalten eine mächtige, visuelle Agenten-Umgebung, behalten aber die volle Kontrolle über Ihre Daten. [6, 11, 12] </w:t>
+      </w:r>
+    </w:p>
+    <w:p>
+      <w:pPr>
+        <w:numPr>
+          <w:ilvl w:val="0"/>
+          <w:numId w:val="5"/>
+        </w:numPr>
+      </w:pPr>
+      <w:r>
+        <w:rPr>
+          <w:b/>
+          <w:bCs/>
+        </w:rPr>
+        <w:t>Für komplexe, autonome "Software-Ingenieur"-Aufgaben:</w:t>
+      </w:r>
+      <w:r>
+        <w:br/>
+        <w:t xml:space="preserve">Hier dominieren Plattformen wie </w:t>
+      </w:r>
+      <w:r>
+        <w:rPr>
+          <w:b/>
+          <w:bCs/>
+        </w:rPr>
+        <w:t>Devin</w:t>
+      </w:r>
+      <w:r>
+        <w:t xml:space="preserve"> (kommerziell) oder </w:t>
+      </w:r>
+      <w:proofErr w:type="spellStart"/>
+      <w:r>
+        <w:rPr>
+          <w:b/>
+          <w:bCs/>
+        </w:rPr>
+        <w:t>OpenHands</w:t>
+      </w:r>
+      <w:proofErr w:type="spellEnd"/>
+      <w:r>
+        <w:t xml:space="preserve"> (Open Source), da diese im Gegensatz zu Claude Code stundenlang im Hintergrund an einem Problem arbeiten können, während Sie etwas anderes tun. [6, 17] </w:t>
+      </w:r>
+    </w:p>
+    <w:p>
+      <w:r>
+        <w:t xml:space="preserve">Möchten Sie ein Tool für ein </w:t>
+      </w:r>
+      <w:r>
+        <w:rPr>
+          <w:b/>
+          <w:bCs/>
+        </w:rPr>
+        <w:t>bestimmtes Projekt</w:t>
+      </w:r>
+      <w:r>
+        <w:t xml:space="preserve"> (z. B. Legacy-Code </w:t>
+      </w:r>
+      <w:proofErr w:type="spellStart"/>
+      <w:r>
+        <w:t>refaktorieren</w:t>
+      </w:r>
+      <w:proofErr w:type="spellEnd"/>
+      <w:r>
+        <w:t xml:space="preserve">, eine neue Web-App bauen) einsetzen, oder suchen Sie nach einer </w:t>
+      </w:r>
+      <w:r>
+        <w:rPr>
+          <w:b/>
+          <w:bCs/>
+        </w:rPr>
+        <w:t>günstigen Alternative</w:t>
+      </w:r>
+      <w:r>
+        <w:t xml:space="preserve"> für Ihr Team? [10] </w:t>
+      </w:r>
+    </w:p>
+    <w:p/>
     <w:sectPr>
       <w:pgSz w:w="11906" w:h="16838"/>
       <w:pgMar w:top="1417" w:right="1417" w:bottom="1134" w:left="1417" w:header="708" w:footer="708" w:gutter="0"/>
@@ -1355,6 +4253,119 @@
     </w:lvl>
   </w:abstractNum>
   <w:abstractNum w:abstractNumId="2" w15:restartNumberingAfterBreak="0">
+    <w:nsid w:val="340851FA"/>
+    <w:multiLevelType w:val="multilevel"/>
+    <w:tmpl w:val="71A671CC"/>
+    <w:lvl w:ilvl="0">
+      <w:start w:val="1"/>
+      <w:numFmt w:val="decimal"/>
+      <w:lvlText w:val="%1."/>
+      <w:lvlJc w:val="left"/>
+      <w:pPr>
+        <w:tabs>
+          <w:tab w:val="num" w:pos="720"/>
+        </w:tabs>
+        <w:ind w:left="720" w:hanging="360"/>
+      </w:pPr>
+    </w:lvl>
+    <w:lvl w:ilvl="1" w:tentative="1">
+      <w:start w:val="1"/>
+      <w:numFmt w:val="decimal"/>
+      <w:lvlText w:val="%2."/>
+      <w:lvlJc w:val="left"/>
+      <w:pPr>
+        <w:tabs>
+          <w:tab w:val="num" w:pos="1440"/>
+        </w:tabs>
+        <w:ind w:left="1440" w:hanging="360"/>
+      </w:pPr>
+    </w:lvl>
+    <w:lvl w:ilvl="2" w:tentative="1">
+      <w:start w:val="1"/>
+      <w:numFmt w:val="decimal"/>
+      <w:lvlText w:val="%3."/>
+      <w:lvlJc w:val="left"/>
+      <w:pPr>
+        <w:tabs>
+          <w:tab w:val="num" w:pos="2160"/>
+        </w:tabs>
+        <w:ind w:left="2160" w:hanging="360"/>
+      </w:pPr>
+    </w:lvl>
+    <w:lvl w:ilvl="3" w:tentative="1">
+      <w:start w:val="1"/>
+      <w:numFmt w:val="decimal"/>
+      <w:lvlText w:val="%4."/>
+      <w:lvlJc w:val="left"/>
+      <w:pPr>
+        <w:tabs>
+          <w:tab w:val="num" w:pos="2880"/>
+        </w:tabs>
+        <w:ind w:left="2880" w:hanging="360"/>
+      </w:pPr>
+    </w:lvl>
+    <w:lvl w:ilvl="4" w:tentative="1">
+      <w:start w:val="1"/>
+      <w:numFmt w:val="decimal"/>
+      <w:lvlText w:val="%5."/>
+      <w:lvlJc w:val="left"/>
+      <w:pPr>
+        <w:tabs>
+          <w:tab w:val="num" w:pos="3600"/>
+        </w:tabs>
+        <w:ind w:left="3600" w:hanging="360"/>
+      </w:pPr>
+    </w:lvl>
+    <w:lvl w:ilvl="5" w:tentative="1">
+      <w:start w:val="1"/>
+      <w:numFmt w:val="decimal"/>
+      <w:lvlText w:val="%6."/>
+      <w:lvlJc w:val="left"/>
+      <w:pPr>
+        <w:tabs>
+          <w:tab w:val="num" w:pos="4320"/>
+        </w:tabs>
+        <w:ind w:left="4320" w:hanging="360"/>
+      </w:pPr>
+    </w:lvl>
+    <w:lvl w:ilvl="6" w:tentative="1">
+      <w:start w:val="1"/>
+      <w:numFmt w:val="decimal"/>
+      <w:lvlText w:val="%7."/>
+      <w:lvlJc w:val="left"/>
+      <w:pPr>
+        <w:tabs>
+          <w:tab w:val="num" w:pos="5040"/>
+        </w:tabs>
+        <w:ind w:left="5040" w:hanging="360"/>
+      </w:pPr>
+    </w:lvl>
+    <w:lvl w:ilvl="7" w:tentative="1">
+      <w:start w:val="1"/>
+      <w:numFmt w:val="decimal"/>
+      <w:lvlText w:val="%8."/>
+      <w:lvlJc w:val="left"/>
+      <w:pPr>
+        <w:tabs>
+          <w:tab w:val="num" w:pos="5760"/>
+        </w:tabs>
+        <w:ind w:left="5760" w:hanging="360"/>
+      </w:pPr>
+    </w:lvl>
+    <w:lvl w:ilvl="8" w:tentative="1">
+      <w:start w:val="1"/>
+      <w:numFmt w:val="decimal"/>
+      <w:lvlText w:val="%9."/>
+      <w:lvlJc w:val="left"/>
+      <w:pPr>
+        <w:tabs>
+          <w:tab w:val="num" w:pos="6480"/>
+        </w:tabs>
+        <w:ind w:left="6480" w:hanging="360"/>
+      </w:pPr>
+    </w:lvl>
+  </w:abstractNum>
+  <w:abstractNum w:abstractNumId="3" w15:restartNumberingAfterBreak="0">
     <w:nsid w:val="6C50009B"/>
     <w:multiLevelType w:val="multilevel"/>
     <w:tmpl w:val="C7348FF0"/>
@@ -1503,7 +4514,7 @@
       </w:rPr>
     </w:lvl>
   </w:abstractNum>
-  <w:abstractNum w:abstractNumId="3" w15:restartNumberingAfterBreak="0">
+  <w:abstractNum w:abstractNumId="4" w15:restartNumberingAfterBreak="0">
     <w:nsid w:val="72FE39DF"/>
     <w:multiLevelType w:val="multilevel"/>
     <w:tmpl w:val="DC6CCFE4"/>
@@ -1659,9 +4670,12 @@
     <w:abstractNumId w:val="0"/>
   </w:num>
   <w:num w:numId="3" w16cid:durableId="1777098021">
+    <w:abstractNumId w:val="4"/>
+  </w:num>
+  <w:num w:numId="4" w16cid:durableId="660502839">
     <w:abstractNumId w:val="3"/>
   </w:num>
-  <w:num w:numId="4" w16cid:durableId="660502839">
+  <w:num w:numId="5" w16cid:durableId="32272318">
     <w:abstractNumId w:val="2"/>
   </w:num>
 </w:numbering>
@@ -2270,7 +5284,6 @@
   <w:style w:type="character" w:default="1" w:styleId="Absatz-Standardschriftart">
     <w:name w:val="Default Paragraph Font"/>
     <w:uiPriority w:val="1"/>
-    <w:semiHidden/>
     <w:unhideWhenUsed/>
   </w:style>
   <w:style w:type="table" w:default="1" w:styleId="NormaleTabelle">
@@ -2582,6 +5595,29 @@
       <w:smallCaps/>
       <w:color w:val="0F4761" w:themeColor="accent1" w:themeShade="BF"/>
       <w:spacing w:val="5"/>
+    </w:rPr>
+  </w:style>
+  <w:style w:type="character" w:styleId="Hyperlink">
+    <w:name w:val="Hyperlink"/>
+    <w:basedOn w:val="Absatz-Standardschriftart"/>
+    <w:uiPriority w:val="99"/>
+    <w:unhideWhenUsed/>
+    <w:rsid w:val="00296F6B"/>
+    <w:rPr>
+      <w:color w:val="467886" w:themeColor="hyperlink"/>
+      <w:u w:val="single"/>
+    </w:rPr>
+  </w:style>
+  <w:style w:type="character" w:styleId="NichtaufgelsteErwhnung">
+    <w:name w:val="Unresolved Mention"/>
+    <w:basedOn w:val="Absatz-Standardschriftart"/>
+    <w:uiPriority w:val="99"/>
+    <w:semiHidden/>
+    <w:unhideWhenUsed/>
+    <w:rsid w:val="00296F6B"/>
+    <w:rPr>
+      <w:color w:val="605E5C"/>
+      <w:shd w:val="clear" w:color="auto" w:fill="E1DFDD"/>
     </w:rPr>
   </w:style>
 </w:styles>

</xml_diff>